<commit_message>
docs: update requirements audit
</commit_message>
<xml_diff>
--- a/docs/#138_Requirements_Audit.docx
+++ b/docs/#138_Requirements_Audit.docx
@@ -507,8 +507,71 @@
                 <w:sz w:val="22"/>
                 <w:szCs w:val="22"/>
               </w:rPr>
-              <w:t>Filter controls can be selected, but applying them does not change the displayed games.</w:t>
-            </w:r>
+              <w:t>F</w:t>
+            </w:r>
+            <w:r>
+              <w:rPr>
+                <w:sz w:val="22"/>
+                <w:szCs w:val="22"/>
+              </w:rPr>
+              <w:t xml:space="preserve">ilter partially changes the displayed results, but the results are not correctly restricted to the selected attribute. For example, selecting the </w:t>
+            </w:r>
+            <w:r>
+              <w:rPr>
+                <w:i/>
+                <w:iCs/>
+                <w:sz w:val="22"/>
+                <w:szCs w:val="22"/>
+              </w:rPr>
+              <w:t>Card Game</w:t>
+            </w:r>
+            <w:r>
+              <w:rPr>
+                <w:sz w:val="22"/>
+                <w:szCs w:val="22"/>
+              </w:rPr>
+              <w:t xml:space="preserve"> category still displays games associated with other categories such as </w:t>
+            </w:r>
+            <w:r>
+              <w:rPr>
+                <w:i/>
+                <w:iCs/>
+                <w:sz w:val="22"/>
+                <w:szCs w:val="22"/>
+              </w:rPr>
+              <w:t>Strategy</w:t>
+            </w:r>
+            <w:r>
+              <w:rPr>
+                <w:sz w:val="22"/>
+                <w:szCs w:val="22"/>
+              </w:rPr>
+              <w:t xml:space="preserve"> and </w:t>
+            </w:r>
+            <w:r>
+              <w:rPr>
+                <w:i/>
+                <w:iCs/>
+                <w:sz w:val="22"/>
+                <w:szCs w:val="22"/>
+              </w:rPr>
+              <w:t>Family</w:t>
+            </w:r>
+            <w:r>
+              <w:rPr>
+                <w:sz w:val="22"/>
+                <w:szCs w:val="22"/>
+              </w:rPr>
+              <w:t xml:space="preserve">. </w:t>
+            </w:r>
+          </w:p>
+          <w:p>
+            <w:pPr>
+              <w:rPr>
+                <w:sz w:val="22"/>
+                <w:szCs w:val="22"/>
+              </w:rPr>
+            </w:pPr>
           </w:p>
         </w:tc>
         <w:tc>
@@ -527,7 +590,7 @@
                 <w:sz w:val="22"/>
                 <w:szCs w:val="22"/>
               </w:rPr>
-              <w:t>Fail / Not implemented</w:t>
+              <w:t>Partial</w:t>
             </w:r>
           </w:p>
         </w:tc>
@@ -547,7 +610,7 @@
                 <w:sz w:val="22"/>
                 <w:szCs w:val="22"/>
               </w:rPr>
-              <w:t>Filter UI is present, but filtering is not currently applied to catalogue results.</w:t>
+              <w:t>Filter controls are present and affect the number of displayed products, but filtering does not correctly restrict results to the selected category.</w:t>
             </w:r>
           </w:p>
         </w:tc>
@@ -619,7 +682,7 @@
                 <w:sz w:val="22"/>
                 <w:szCs w:val="22"/>
               </w:rPr>
-              <w:t>Attempted to open a board game from the guest Catalogue. Product cards provide summary information but no clickable route or control to open a detailed product view.</w:t>
+              <w:t>From the catalogue, selected a game card and verified that it opened a dedicated product-detail view containing additional information about that game.</w:t>
             </w:r>
           </w:p>
         </w:tc>
@@ -639,7 +702,7 @@
                 <w:sz w:val="22"/>
                 <w:szCs w:val="22"/>
               </w:rPr>
-              <w:t>Guest cannot access detailed product information from the Catalogue.</w:t>
+              <w:t>Selecting a game opens its product-detail page and displays additional information about the selected game.</w:t>
             </w:r>
           </w:p>
         </w:tc>
@@ -659,7 +722,7 @@
                 <w:sz w:val="22"/>
                 <w:szCs w:val="22"/>
               </w:rPr>
-              <w:t>Fail / Not implemented</w:t>
+              <w:t>Pass</w:t>
             </w:r>
           </w:p>
         </w:tc>
@@ -679,7 +742,7 @@
                 <w:sz w:val="22"/>
                 <w:szCs w:val="22"/>
               </w:rPr>
-              <w:t>Product Detail screen cannot currently be reached by a guest.</w:t>
+              <w:t>Product detail functionality is implemented and accessible from the catalogue.</w:t>
             </w:r>
           </w:p>
         </w:tc>
@@ -751,7 +814,15 @@
                 <w:sz w:val="22"/>
                 <w:szCs w:val="22"/>
               </w:rPr>
-              <w:t>Opened Register as a guest, completed the required registration fields with a valid password, submitted the form, and was successfully admitted into the application as the newly registered user.</w:t>
+              <w:t xml:space="preserve">Opened Register as a guest, completed the required registration fields with a valid password, submitted </w:t>
+            </w:r>
+            <w:r>
+              <w:rPr>
+                <w:sz w:val="22"/>
+                <w:szCs w:val="22"/>
+              </w:rPr>
+              <w:lastRenderedPageBreak/>
+              <w:t>the form, and was successfully admitted into the application as the newly registered user.</w:t>
             </w:r>
           </w:p>
         </w:tc>
@@ -771,6 +842,7 @@
                 <w:sz w:val="22"/>
                 <w:szCs w:val="22"/>
               </w:rPr>
+              <w:lastRenderedPageBreak/>
               <w:t>Account registration completed successfully.</w:t>
             </w:r>
           </w:p>
@@ -811,7 +883,15 @@
                 <w:sz w:val="22"/>
                 <w:szCs w:val="22"/>
               </w:rPr>
-              <w:t>A transient "Failed to fetch" message appeared during submission, but registration ultimately succeeded and the user was logged in.</w:t>
+              <w:t xml:space="preserve">A transient "Failed to fetch" message appeared during submission, but </w:t>
+            </w:r>
+            <w:r>
+              <w:rPr>
+                <w:sz w:val="22"/>
+                <w:szCs w:val="22"/>
+              </w:rPr>
+              <w:lastRenderedPageBreak/>
+              <w:t>registration ultimately succeeded and the user was logged in.</w:t>
             </w:r>
           </w:p>
         </w:tc>
@@ -836,6 +916,7 @@
                 <w:sz w:val="22"/>
                 <w:szCs w:val="22"/>
               </w:rPr>
+              <w:lastRenderedPageBreak/>
               <w:t>FR-G</w:t>
             </w:r>
             <w:r>
@@ -968,7 +1049,6 @@
                 <w:sz w:val="22"/>
                 <w:szCs w:val="22"/>
               </w:rPr>
-              <w:lastRenderedPageBreak/>
               <w:t>FR-C1</w:t>
             </w:r>
           </w:p>
@@ -1405,7 +1485,7 @@
                 <w:sz w:val="22"/>
                 <w:szCs w:val="22"/>
               </w:rPr>
-              <w:t>Logged in as a registered customer and applied catalogue filters. Filter controls could be selected, but the displayed games did not change according to the selected filter.</w:t>
+              <w:t>Logged in as a registered customer and applied catalogue filters. The filter controls could be selected, and the number of displayed games changed, but the results were not correctly restricted to the selected filter. For example, selecting the Card Game category still displayed games associated with other categories such as Strategy and Family.</w:t>
             </w:r>
           </w:p>
         </w:tc>
@@ -1425,8 +1505,71 @@
                 <w:sz w:val="22"/>
                 <w:szCs w:val="22"/>
               </w:rPr>
-              <w:t>Filters do not affect the displayed catalogue results.</w:t>
-            </w:r>
+              <w:t>F</w:t>
+            </w:r>
+            <w:r>
+              <w:rPr>
+                <w:sz w:val="22"/>
+                <w:szCs w:val="22"/>
+              </w:rPr>
+              <w:t xml:space="preserve">ilter partially changes the displayed results, but the results are not correctly restricted to the selected attribute. For example, selecting the </w:t>
+            </w:r>
+            <w:r>
+              <w:rPr>
+                <w:i/>
+                <w:iCs/>
+                <w:sz w:val="22"/>
+                <w:szCs w:val="22"/>
+              </w:rPr>
+              <w:t>Card Game</w:t>
+            </w:r>
+            <w:r>
+              <w:rPr>
+                <w:sz w:val="22"/>
+                <w:szCs w:val="22"/>
+              </w:rPr>
+              <w:t xml:space="preserve"> category still displays games associated with other categories such as </w:t>
+            </w:r>
+            <w:r>
+              <w:rPr>
+                <w:i/>
+                <w:iCs/>
+                <w:sz w:val="22"/>
+                <w:szCs w:val="22"/>
+              </w:rPr>
+              <w:t>Strategy</w:t>
+            </w:r>
+            <w:r>
+              <w:rPr>
+                <w:sz w:val="22"/>
+                <w:szCs w:val="22"/>
+              </w:rPr>
+              <w:t xml:space="preserve"> and </w:t>
+            </w:r>
+            <w:r>
+              <w:rPr>
+                <w:i/>
+                <w:iCs/>
+                <w:sz w:val="22"/>
+                <w:szCs w:val="22"/>
+              </w:rPr>
+              <w:t>Family</w:t>
+            </w:r>
+            <w:r>
+              <w:rPr>
+                <w:sz w:val="22"/>
+                <w:szCs w:val="22"/>
+              </w:rPr>
+              <w:t xml:space="preserve">. </w:t>
+            </w:r>
+          </w:p>
+          <w:p>
+            <w:pPr>
+              <w:rPr>
+                <w:sz w:val="22"/>
+                <w:szCs w:val="22"/>
+              </w:rPr>
+            </w:pPr>
           </w:p>
         </w:tc>
         <w:tc>
@@ -1445,7 +1588,7 @@
                 <w:sz w:val="22"/>
                 <w:szCs w:val="22"/>
               </w:rPr>
-              <w:t>Fail / Not implemented</w:t>
+              <w:t>Partial</w:t>
             </w:r>
           </w:p>
         </w:tc>
@@ -1465,7 +1608,7 @@
                 <w:sz w:val="22"/>
                 <w:szCs w:val="22"/>
               </w:rPr>
-              <w:t>Filter UI exists, but the filtering functionality is not currently working.</w:t>
+              <w:t>Filter controls are present and affect the number of displayed products, but filtering does not correctly restrict results to the selected category.</w:t>
             </w:r>
           </w:p>
         </w:tc>
@@ -1517,7 +1660,15 @@
                 <w:sz w:val="22"/>
                 <w:szCs w:val="22"/>
               </w:rPr>
-              <w:t>The system will allow registered customers to view detailed product information.</w:t>
+              <w:t xml:space="preserve">The system will allow registered customers </w:t>
+            </w:r>
+            <w:r>
+              <w:rPr>
+                <w:sz w:val="22"/>
+                <w:szCs w:val="22"/>
+              </w:rPr>
+              <w:lastRenderedPageBreak/>
+              <w:t>to view detailed product information.</w:t>
             </w:r>
           </w:p>
         </w:tc>
@@ -1537,7 +1688,16 @@
                 <w:sz w:val="22"/>
                 <w:szCs w:val="22"/>
               </w:rPr>
-              <w:t>Logged in as a registered customer and attempted to open a board game from the Catalogue. No product card, title, button, or other control provided access to a detailed product view.</w:t>
+              <w:lastRenderedPageBreak/>
+              <w:t xml:space="preserve">From the catalogue, selected a game card and verified that it opened a dedicated product-detail </w:t>
+            </w:r>
+            <w:r>
+              <w:rPr>
+                <w:sz w:val="22"/>
+                <w:szCs w:val="22"/>
+              </w:rPr>
+              <w:lastRenderedPageBreak/>
+              <w:t>view containing additional information about that game.</w:t>
             </w:r>
           </w:p>
         </w:tc>
@@ -1557,7 +1717,22 @@
                 <w:sz w:val="22"/>
                 <w:szCs w:val="22"/>
               </w:rPr>
-              <w:t>Customer cannot access detailed product information.</w:t>
+              <w:lastRenderedPageBreak/>
+              <w:t xml:space="preserve">Customer </w:t>
+            </w:r>
+            <w:r>
+              <w:rPr>
+                <w:sz w:val="22"/>
+                <w:szCs w:val="22"/>
+              </w:rPr>
+              <w:t xml:space="preserve">can </w:t>
+            </w:r>
+            <w:r>
+              <w:rPr>
+                <w:sz w:val="22"/>
+                <w:szCs w:val="22"/>
+              </w:rPr>
+              <w:t>access detailed product information.</w:t>
             </w:r>
           </w:p>
         </w:tc>
@@ -1577,7 +1752,7 @@
                 <w:sz w:val="22"/>
                 <w:szCs w:val="22"/>
               </w:rPr>
-              <w:t>Fail / Not implemented</w:t>
+              <w:t>Pass</w:t>
             </w:r>
           </w:p>
         </w:tc>
@@ -1597,7 +1772,15 @@
                 <w:sz w:val="22"/>
                 <w:szCs w:val="22"/>
               </w:rPr>
-              <w:t>Product detail functionality is currently unreachable from the Catalogue.</w:t>
+              <w:t xml:space="preserve">Product detail functionality is implemented and </w:t>
+            </w:r>
+            <w:r>
+              <w:rPr>
+                <w:sz w:val="22"/>
+                <w:szCs w:val="22"/>
+              </w:rPr>
+              <w:lastRenderedPageBreak/>
+              <w:t>accessible from the catalogue.</w:t>
             </w:r>
           </w:p>
         </w:tc>
@@ -1622,6 +1805,7 @@
                 <w:sz w:val="22"/>
                 <w:szCs w:val="22"/>
               </w:rPr>
+              <w:lastRenderedPageBreak/>
               <w:t>FR-C</w:t>
             </w:r>
             <w:r>
@@ -1669,7 +1853,23 @@
                 <w:sz w:val="22"/>
                 <w:szCs w:val="22"/>
               </w:rPr>
-              <w:t>Logged in as a registered customer and inspected the Catalogue product cards. No Add to Cart control was available, and products could not be selected to access such an action.</w:t>
+              <w:t xml:space="preserve">Logged-in customer selected a game and clicked </w:t>
+            </w:r>
+            <w:r>
+              <w:rPr>
+                <w:b/>
+                <w:bCs/>
+                <w:sz w:val="22"/>
+                <w:szCs w:val="22"/>
+              </w:rPr>
+              <w:t>Add to Cart</w:t>
+            </w:r>
+            <w:r>
+              <w:rPr>
+                <w:sz w:val="22"/>
+                <w:szCs w:val="22"/>
+              </w:rPr>
+              <w:t>; product was successfully added and an “Added” confirmation was displayed.</w:t>
             </w:r>
           </w:p>
         </w:tc>
@@ -1689,7 +1889,21 @@
                 <w:sz w:val="22"/>
                 <w:szCs w:val="22"/>
               </w:rPr>
-              <w:t>Customer cannot add products to the cart.</w:t>
+              <w:t>Customer can</w:t>
+            </w:r>
+            <w:r>
+              <w:rPr>
+                <w:sz w:val="22"/>
+                <w:szCs w:val="22"/>
+              </w:rPr>
+              <w:t xml:space="preserve"> </w:t>
+            </w:r>
+            <w:r>
+              <w:rPr>
+                <w:sz w:val="22"/>
+                <w:szCs w:val="22"/>
+              </w:rPr>
+              <w:t>add products to the cart.</w:t>
             </w:r>
           </w:p>
         </w:tc>
@@ -1709,7 +1923,7 @@
                 <w:sz w:val="22"/>
                 <w:szCs w:val="22"/>
               </w:rPr>
-              <w:t>Fail / Not implemented</w:t>
+              <w:t>Pass</w:t>
             </w:r>
           </w:p>
         </w:tc>
@@ -1718,17 +1932,19 @@
             <w:tcW w:w="2693" w:type="dxa"/>
           </w:tcPr>
           <w:p>
-            <w:r>
-              <w:t>Add-to-cart functionality is not currently available from the customer Catalogue.</w:t>
-            </w:r>
-          </w:p>
-          <w:p>
-            <w:pPr>
-              <w:rPr>
-                <w:sz w:val="22"/>
-                <w:szCs w:val="22"/>
-              </w:rPr>
-            </w:pPr>
+            <w:pPr>
+              <w:rPr>
+                <w:sz w:val="22"/>
+                <w:szCs w:val="22"/>
+              </w:rPr>
+            </w:pPr>
+            <w:r>
+              <w:rPr>
+                <w:sz w:val="22"/>
+                <w:szCs w:val="22"/>
+              </w:rPr>
+              <w:t>Add-to-cart functionality is implemented.</w:t>
+            </w:r>
           </w:p>
         </w:tc>
       </w:tr>
@@ -1799,14 +2015,7 @@
                 <w:sz w:val="22"/>
                 <w:szCs w:val="22"/>
               </w:rPr>
-              <w:t xml:space="preserve">Logged in as a registered customer and selected the Cart option. The Cart route displayed only the placeholder message </w:t>
-            </w:r>
-            <w:r>
-              <w:rPr>
-                <w:sz w:val="22"/>
-                <w:szCs w:val="22"/>
-              </w:rPr>
-              <w:t>"S4 — placeholder page."</w:t>
+              <w:t>Added a game to the cart, opened the cart, changed the item's quantity, and removed the item. All three operations worked successfully.</w:t>
             </w:r>
           </w:p>
         </w:tc>
@@ -1826,7 +2035,7 @@
                 <w:sz w:val="22"/>
                 <w:szCs w:val="22"/>
               </w:rPr>
-              <w:t>Cart functionality is not available. Items cannot be viewed, updated, or removed.</w:t>
+              <w:t>The customer can view items in the cart, update quantities, and remove items successfully.</w:t>
             </w:r>
           </w:p>
         </w:tc>
@@ -1846,7 +2055,7 @@
                 <w:sz w:val="22"/>
                 <w:szCs w:val="22"/>
               </w:rPr>
-              <w:t>Fail / Not implemented</w:t>
+              <w:t>Pass</w:t>
             </w:r>
           </w:p>
         </w:tc>
@@ -1866,7 +2075,7 @@
                 <w:sz w:val="22"/>
                 <w:szCs w:val="22"/>
               </w:rPr>
-              <w:t>Cart screen is currently a placeholder.</w:t>
+              <w:t>Cart management functionality is implemented.</w:t>
             </w:r>
           </w:p>
         </w:tc>
@@ -1891,7 +2100,6 @@
                 <w:sz w:val="22"/>
                 <w:szCs w:val="22"/>
               </w:rPr>
-              <w:lastRenderedPageBreak/>
               <w:t>FR-C</w:t>
             </w:r>
             <w:r>
@@ -1939,21 +2147,7 @@
                 <w:sz w:val="22"/>
                 <w:szCs w:val="22"/>
               </w:rPr>
-              <w:t xml:space="preserve">Logged in as a registered customer and opened the Cart tab. The Cart page displayed </w:t>
-            </w:r>
-            <w:r>
-              <w:rPr>
-                <w:sz w:val="22"/>
-                <w:szCs w:val="22"/>
-              </w:rPr>
-              <w:t>only "S4 — placeholder page" and contained no Checkout</w:t>
-            </w:r>
-            <w:r>
-              <w:rPr>
-                <w:sz w:val="22"/>
-                <w:szCs w:val="22"/>
-              </w:rPr>
-              <w:t>, Proceed to Checkout, or equivalent link/button.</w:t>
+              <w:t>Added a product to the cart, opened the cart, selected checkout, and verified that the checkout page opened to the delivery/address step.</w:t>
             </w:r>
           </w:p>
         </w:tc>
@@ -1973,7 +2167,7 @@
                 <w:sz w:val="22"/>
                 <w:szCs w:val="22"/>
               </w:rPr>
-              <w:t>Customer cannot proceed to checkout through the implemented cart flow.</w:t>
+              <w:t>The customer can proceed from the cart to the checkout page, where the delivery address information can be entered.</w:t>
             </w:r>
           </w:p>
         </w:tc>
@@ -1993,7 +2187,7 @@
                 <w:sz w:val="22"/>
                 <w:szCs w:val="22"/>
               </w:rPr>
-              <w:t>Fail / Not implemented</w:t>
+              <w:t>Pass</w:t>
             </w:r>
           </w:p>
         </w:tc>
@@ -2013,7 +2207,7 @@
                 <w:sz w:val="22"/>
                 <w:szCs w:val="22"/>
               </w:rPr>
-              <w:t>Checkout cannot be reached because the Cart screen is currently a placeholder.</w:t>
+              <w:t>Checkout functionality is implemented and accessible from the cart.</w:t>
             </w:r>
           </w:p>
         </w:tc>
@@ -2085,35 +2279,7 @@
                 <w:sz w:val="22"/>
                 <w:szCs w:val="22"/>
               </w:rPr>
-              <w:t xml:space="preserve">Opened the </w:t>
-            </w:r>
-            <w:r>
-              <w:rPr>
-                <w:sz w:val="22"/>
-                <w:szCs w:val="22"/>
-              </w:rPr>
-              <w:t>My Orders</w:t>
-            </w:r>
-            <w:r>
-              <w:rPr>
-                <w:sz w:val="22"/>
-                <w:szCs w:val="22"/>
-              </w:rPr>
-              <w:t xml:space="preserve"> page while logged in. The page only displayed order-status filters and the message </w:t>
-            </w:r>
-            <w:r>
-              <w:rPr>
-                <w:sz w:val="22"/>
-                <w:szCs w:val="22"/>
-              </w:rPr>
-              <w:t>"You have no orders yet."</w:t>
-            </w:r>
-            <w:r>
-              <w:rPr>
-                <w:sz w:val="22"/>
-                <w:szCs w:val="22"/>
-              </w:rPr>
-              <w:t xml:space="preserve"> No checkout or order-information form was available.</w:t>
+              <w:t>Logged-in customer proceeded to checkout and verified that the delivery page contains address input fields. The page explicitly states that address saving is not yet wired to the API.</w:t>
             </w:r>
           </w:p>
         </w:tc>
@@ -2133,7 +2299,7 @@
                 <w:sz w:val="22"/>
                 <w:szCs w:val="22"/>
               </w:rPr>
-              <w:t>Customer cannot enter the information required to place an order.</w:t>
+              <w:t>The checkout page provides address fields for entering delivery information, but address saving is not connected to the API, preventing the entered order information from being persisted as part of the checkout process.</w:t>
             </w:r>
           </w:p>
         </w:tc>
@@ -2153,7 +2319,7 @@
                 <w:sz w:val="22"/>
                 <w:szCs w:val="22"/>
               </w:rPr>
-              <w:t>Fail / Not implemented</w:t>
+              <w:t>Partial</w:t>
             </w:r>
           </w:p>
         </w:tc>
@@ -2173,7 +2339,7 @@
                 <w:sz w:val="22"/>
                 <w:szCs w:val="22"/>
               </w:rPr>
-              <w:t>No accessible checkout/order-information form is currently implemented.</w:t>
+              <w:t>The UI for entering delivery information is implemented, but the API integration required to use the information during checkout is incomplete.</w:t>
             </w:r>
           </w:p>
         </w:tc>
@@ -2245,7 +2411,23 @@
                 <w:sz w:val="22"/>
                 <w:szCs w:val="22"/>
               </w:rPr>
-              <w:t>Inspected the available customer navigation and screens while logged in. No Checkout, Place Order, Buy Now, Create Order, or equivalent order-placement option was available.</w:t>
+              <w:t xml:space="preserve">Proceeded to the checkout delivery page. The </w:t>
+            </w:r>
+            <w:r>
+              <w:rPr>
+                <w:b/>
+                <w:bCs/>
+                <w:sz w:val="22"/>
+                <w:szCs w:val="22"/>
+              </w:rPr>
+              <w:t>Place Order</w:t>
+            </w:r>
+            <w:r>
+              <w:rPr>
+                <w:sz w:val="22"/>
+                <w:szCs w:val="22"/>
+              </w:rPr>
+              <w:t xml:space="preserve"> button was greyed out and could not be used to submit the order.</w:t>
             </w:r>
           </w:p>
         </w:tc>
@@ -2265,7 +2447,23 @@
                 <w:sz w:val="22"/>
                 <w:szCs w:val="22"/>
               </w:rPr>
-              <w:t>Customer cannot place an order through the implemented UI.</w:t>
+              <w:t xml:space="preserve">The customer cannot place an order from the checkout page because the </w:t>
+            </w:r>
+            <w:r>
+              <w:rPr>
+                <w:b/>
+                <w:bCs/>
+                <w:sz w:val="22"/>
+                <w:szCs w:val="22"/>
+              </w:rPr>
+              <w:t>Place Order</w:t>
+            </w:r>
+            <w:r>
+              <w:rPr>
+                <w:sz w:val="22"/>
+                <w:szCs w:val="22"/>
+              </w:rPr>
+              <w:t xml:space="preserve"> button is disabled.</w:t>
             </w:r>
           </w:p>
         </w:tc>
@@ -2305,7 +2503,7 @@
                 <w:sz w:val="22"/>
                 <w:szCs w:val="22"/>
               </w:rPr>
-              <w:t>No order-placement flow is currently accessible.</w:t>
+              <w:t>Order placement is not currently functional because checkout address saving/API integration is incomplete.</w:t>
             </w:r>
           </w:p>
         </w:tc>
@@ -2330,6 +2528,7 @@
                 <w:sz w:val="22"/>
                 <w:szCs w:val="22"/>
               </w:rPr>
+              <w:lastRenderedPageBreak/>
               <w:t>FR-C1</w:t>
             </w:r>
             <w:r>
@@ -2377,14 +2576,7 @@
                 <w:sz w:val="22"/>
                 <w:szCs w:val="22"/>
               </w:rPr>
-              <w:t>I</w:t>
-            </w:r>
-            <w:r>
-              <w:rPr>
-                <w:sz w:val="22"/>
-                <w:szCs w:val="22"/>
-              </w:rPr>
-              <w:t>nspected the customer-facing application while logged in. No payment, simulated payment, payment details, or payment completion functionality was available.</w:t>
+              <w:t>Proceeded through the available checkout flow and found no payment screen, payment form, or simulated payment option.</w:t>
             </w:r>
           </w:p>
         </w:tc>
@@ -2404,7 +2596,7 @@
                 <w:sz w:val="22"/>
                 <w:szCs w:val="22"/>
               </w:rPr>
-              <w:t>Customer cannot access or complete a simulated payment.</w:t>
+              <w:t>No payment step or simulated payment interface is available during checkout.</w:t>
             </w:r>
           </w:p>
         </w:tc>
@@ -2444,7 +2636,7 @@
                 <w:sz w:val="22"/>
                 <w:szCs w:val="22"/>
               </w:rPr>
-              <w:t>No customer-facing payment flow is currently implemented.</w:t>
+              <w:t>Simulated payment cannot be tested because order placement is not currently functional and no payment step is exposed.</w:t>
             </w:r>
           </w:p>
         </w:tc>
@@ -2516,21 +2708,7 @@
                 <w:sz w:val="22"/>
                 <w:szCs w:val="22"/>
               </w:rPr>
-              <w:t xml:space="preserve">Logged in as a registered customer and </w:t>
-            </w:r>
-            <w:r>
-              <w:rPr>
-                <w:sz w:val="22"/>
-                <w:szCs w:val="22"/>
-              </w:rPr>
-              <w:t>opened My Orders. The page displayed order-status filters f</w:t>
-            </w:r>
-            <w:r>
-              <w:rPr>
-                <w:sz w:val="22"/>
-                <w:szCs w:val="22"/>
-              </w:rPr>
-              <w:t>or All, Pending, Paid, Shipped, Delivered, and Cancelled, but the account had no existing orders to display.</w:t>
+              <w:t>Verified that order placement is unavailable because the Place Order button is disabled. Therefore, no completed order can be created through the customer UI for use in testing order history.</w:t>
             </w:r>
           </w:p>
         </w:tc>
@@ -2550,7 +2728,7 @@
                 <w:sz w:val="22"/>
                 <w:szCs w:val="22"/>
               </w:rPr>
-              <w:t>Order-history screen is available, but displaying an actual order history could not be verified because the test account has no orders.</w:t>
+              <w:t>Order History cannot be meaningfully verified through the normal customer journey because the current checkout flow does not allow an order to be placed.</w:t>
             </w:r>
           </w:p>
         </w:tc>
@@ -2590,7 +2768,7 @@
                 <w:sz w:val="22"/>
                 <w:szCs w:val="22"/>
               </w:rPr>
-              <w:t>No order could be created through the current customer UI to populate the history.</w:t>
+              <w:t>This requirement requires a completed order to verify that order history displays the customer's previous orders. The current checkout limitation prevents end-to-end verification.</w:t>
             </w:r>
           </w:p>
         </w:tc>
@@ -2774,15 +2952,7 @@
                 <w:sz w:val="22"/>
                 <w:szCs w:val="22"/>
               </w:rPr>
-              <w:t xml:space="preserve">The system will allow registered customers </w:t>
-            </w:r>
-            <w:r>
-              <w:rPr>
-                <w:sz w:val="22"/>
-                <w:szCs w:val="22"/>
-              </w:rPr>
-              <w:lastRenderedPageBreak/>
-              <w:t>to submit product reviews.</w:t>
+              <w:t>The system will allow registered customers to submit product reviews.</w:t>
             </w:r>
           </w:p>
         </w:tc>
@@ -2802,16 +2972,16 @@
                 <w:sz w:val="22"/>
                 <w:szCs w:val="22"/>
               </w:rPr>
-              <w:lastRenderedPageBreak/>
-              <w:t xml:space="preserve">Logged in as a registered customer and inspected the available customer-facing screens. No review </w:t>
-            </w:r>
-            <w:r>
-              <w:rPr>
-                <w:sz w:val="22"/>
-                <w:szCs w:val="22"/>
-              </w:rPr>
-              <w:lastRenderedPageBreak/>
-              <w:t>functionality, review form, rating control, or option to submit a product review was available.</w:t>
+              <w:t xml:space="preserve">Logged-in customer opened a product detail page and verified that the review functionality is present. The interface states: </w:t>
+            </w:r>
+            <w:r>
+              <w:rPr>
+                <w:b/>
+                <w:bCs/>
+                <w:sz w:val="22"/>
+                <w:szCs w:val="22"/>
+              </w:rPr>
+              <w:t>“You can only review products you have purchased.”</w:t>
             </w:r>
           </w:p>
         </w:tc>
@@ -2831,8 +3001,7 @@
                 <w:sz w:val="22"/>
                 <w:szCs w:val="22"/>
               </w:rPr>
-              <w:lastRenderedPageBreak/>
-              <w:t>Customer cannot submit product reviews through the UI.</w:t>
+              <w:t>A review interface is available on the product detail page, but review submission is restricted to customers who have purchased the product.</w:t>
             </w:r>
           </w:p>
         </w:tc>
@@ -2852,7 +3021,7 @@
                 <w:sz w:val="22"/>
                 <w:szCs w:val="22"/>
               </w:rPr>
-              <w:t>Fail / Not implemented</w:t>
+              <w:t>Unable to verify</w:t>
             </w:r>
           </w:p>
         </w:tc>
@@ -2872,7 +3041,7 @@
                 <w:sz w:val="22"/>
                 <w:szCs w:val="22"/>
               </w:rPr>
-              <w:t>No customer-facing review submission functionality is currently accessible.</w:t>
+              <w:t>End-to-end review submission could not be verified because no completed purchase is available. The current checkout flow prevents creating a qualifying order through the customer UI.</w:t>
             </w:r>
           </w:p>
         </w:tc>
@@ -2937,7 +3106,7 @@
                 <w:sz w:val="22"/>
                 <w:szCs w:val="22"/>
               </w:rPr>
-              <w:t>Logged in as an administrator and inspected the available administrative navigation and controls. No Add Game, Add Product, New Product, Create Product, or equivalent option was available.</w:t>
+              <w:t>Logged in as an admin, selected the add-product option, and verified that the product-creation form was displayed.</w:t>
             </w:r>
           </w:p>
         </w:tc>
@@ -2957,7 +3126,7 @@
                 <w:sz w:val="22"/>
                 <w:szCs w:val="22"/>
               </w:rPr>
-              <w:t>Administrator cannot add a new game through the UI.</w:t>
+              <w:t>The admin dashboard provides an option to add a new game, which opens a product-creation form.</w:t>
             </w:r>
           </w:p>
         </w:tc>
@@ -2977,7 +3146,7 @@
                 <w:sz w:val="22"/>
                 <w:szCs w:val="22"/>
               </w:rPr>
-              <w:t>Fail / Not implemented</w:t>
+              <w:t>Pass</w:t>
             </w:r>
           </w:p>
         </w:tc>
@@ -2997,7 +3166,7 @@
                 <w:sz w:val="22"/>
                 <w:szCs w:val="22"/>
               </w:rPr>
-              <w:t>No accessible admin product-creation interface is currently implemented.</w:t>
+              <w:t>Product creation functionality is available to administrators.</w:t>
             </w:r>
           </w:p>
         </w:tc>
@@ -3049,7 +3218,15 @@
                 <w:sz w:val="22"/>
                 <w:szCs w:val="22"/>
               </w:rPr>
-              <w:t>The system will allow administrators to view product information.</w:t>
+              <w:t xml:space="preserve">The system will allow administrators to </w:t>
+            </w:r>
+            <w:r>
+              <w:rPr>
+                <w:sz w:val="22"/>
+                <w:szCs w:val="22"/>
+              </w:rPr>
+              <w:lastRenderedPageBreak/>
+              <w:t>view product information.</w:t>
             </w:r>
           </w:p>
         </w:tc>
@@ -3069,21 +3246,16 @@
                 <w:sz w:val="22"/>
                 <w:szCs w:val="22"/>
               </w:rPr>
-              <w:t>Logged in as an administrator and inspected the available administrative screens. No product</w:t>
-            </w:r>
-            <w:r>
-              <w:rPr>
-                <w:sz w:val="22"/>
-                <w:szCs w:val="22"/>
-              </w:rPr>
-              <w:t xml:space="preserve"> </w:t>
-            </w:r>
-            <w:r>
-              <w:rPr>
-                <w:sz w:val="22"/>
-                <w:szCs w:val="22"/>
-              </w:rPr>
-              <w:t>management or admin product-information view was available.</w:t>
+              <w:lastRenderedPageBreak/>
+              <w:t xml:space="preserve">Logged in as an administrator and inspected the product-management table, which displayed the </w:t>
+            </w:r>
+            <w:r>
+              <w:rPr>
+                <w:sz w:val="22"/>
+                <w:szCs w:val="22"/>
+              </w:rPr>
+              <w:lastRenderedPageBreak/>
+              <w:t>available games and their associated product information.</w:t>
             </w:r>
           </w:p>
         </w:tc>
@@ -3103,7 +3275,16 @@
                 <w:sz w:val="22"/>
                 <w:szCs w:val="22"/>
               </w:rPr>
-              <w:t>Administrator cannot view product information through the admin UI.</w:t>
+              <w:lastRenderedPageBreak/>
+              <w:t xml:space="preserve">The admin dashboard displays existing games </w:t>
+            </w:r>
+            <w:r>
+              <w:rPr>
+                <w:sz w:val="22"/>
+                <w:szCs w:val="22"/>
+              </w:rPr>
+              <w:lastRenderedPageBreak/>
+              <w:t>and their product information in a table.</w:t>
             </w:r>
           </w:p>
         </w:tc>
@@ -3123,7 +3304,8 @@
                 <w:sz w:val="22"/>
                 <w:szCs w:val="22"/>
               </w:rPr>
-              <w:t>Fail / Not implemented</w:t>
+              <w:lastRenderedPageBreak/>
+              <w:t>Pass</w:t>
             </w:r>
           </w:p>
         </w:tc>
@@ -3143,7 +3325,15 @@
                 <w:sz w:val="22"/>
                 <w:szCs w:val="22"/>
               </w:rPr>
-              <w:t>No accessible admin product-information interface is currently implemented.</w:t>
+              <w:t xml:space="preserve">Administrators can view product information </w:t>
+            </w:r>
+            <w:r>
+              <w:rPr>
+                <w:sz w:val="22"/>
+                <w:szCs w:val="22"/>
+              </w:rPr>
+              <w:lastRenderedPageBreak/>
+              <w:t>through the admin dashboard.</w:t>
             </w:r>
           </w:p>
         </w:tc>
@@ -3168,6 +3358,7 @@
                 <w:sz w:val="22"/>
                 <w:szCs w:val="22"/>
               </w:rPr>
+              <w:lastRenderedPageBreak/>
               <w:t>FR-A</w:t>
             </w:r>
             <w:r>
@@ -3215,7 +3406,7 @@
                 <w:sz w:val="22"/>
                 <w:szCs w:val="22"/>
               </w:rPr>
-              <w:t>Logged in as an administrator and inspected the available product-management functionality. Products/games could not be selected or opened for editing, and no Edit/Update Product control was available.</w:t>
+              <w:t>Logged in as an administrator, selected an existing product from the product table, opened the edit control, and verified that product information could be modified, including the quantity of items.</w:t>
             </w:r>
           </w:p>
         </w:tc>
@@ -3235,7 +3426,7 @@
                 <w:sz w:val="22"/>
                 <w:szCs w:val="22"/>
               </w:rPr>
-              <w:t>Administrator cannot update product information through the UI.</w:t>
+              <w:t>Administrators can select an existing product and edit its information through the admin dashboard.</w:t>
             </w:r>
           </w:p>
         </w:tc>
@@ -3255,7 +3446,7 @@
                 <w:sz w:val="22"/>
                 <w:szCs w:val="22"/>
               </w:rPr>
-              <w:t>Fail / Not implemented</w:t>
+              <w:t>Pass</w:t>
             </w:r>
           </w:p>
         </w:tc>
@@ -3275,7 +3466,7 @@
                 <w:sz w:val="22"/>
                 <w:szCs w:val="22"/>
               </w:rPr>
-              <w:t>No accessible admin product-editing functionality is currently implemented.</w:t>
+              <w:t>Product-editing functionality is available to administrators. The test change was not saved.</w:t>
             </w:r>
           </w:p>
         </w:tc>
@@ -3347,7 +3538,14 @@
                 <w:sz w:val="22"/>
                 <w:szCs w:val="22"/>
               </w:rPr>
-              <w:t>Logged in as an administrator and inspected the available product-management functionality. Products/games could not be selected or opened, and no Delete Product control was available.</w:t>
+              <w:t>L</w:t>
+            </w:r>
+            <w:r>
+              <w:rPr>
+                <w:sz w:val="22"/>
+                <w:szCs w:val="22"/>
+              </w:rPr>
+              <w:t>ogged in as an administrator and inspected the product-management table. Existing products displayed a Delete control.</w:t>
             </w:r>
           </w:p>
         </w:tc>
@@ -3367,7 +3565,7 @@
                 <w:sz w:val="22"/>
                 <w:szCs w:val="22"/>
               </w:rPr>
-              <w:t>Administrator cannot delete products through the UI.</w:t>
+              <w:t>Administrators have access to a Delete control for existing products.</w:t>
             </w:r>
           </w:p>
         </w:tc>
@@ -3387,7 +3585,7 @@
                 <w:sz w:val="22"/>
                 <w:szCs w:val="22"/>
               </w:rPr>
-              <w:t>Fail / Not implemented</w:t>
+              <w:t>Pass</w:t>
             </w:r>
           </w:p>
         </w:tc>
@@ -3407,7 +3605,7 @@
                 <w:sz w:val="22"/>
                 <w:szCs w:val="22"/>
               </w:rPr>
-              <w:t>No accessible admin product-deletion functionality is currently implemented.</w:t>
+              <w:t>Product-deletion functionality is available to administrators. No product was deleted during testing.</w:t>
             </w:r>
           </w:p>
         </w:tc>
@@ -3499,7 +3697,14 @@
                 <w:sz w:val="22"/>
                 <w:szCs w:val="22"/>
               </w:rPr>
-              <w:t>Administrator cannot manage categories through the UI.</w:t>
+              <w:t xml:space="preserve">Administrator cannot manage categories through the </w:t>
+            </w:r>
+            <w:r>
+              <w:rPr>
+                <w:sz w:val="22"/>
+                <w:szCs w:val="22"/>
+              </w:rPr>
+              <w:t>admin dashboard.</w:t>
             </w:r>
           </w:p>
         </w:tc>
@@ -3539,7 +3744,7 @@
                 <w:sz w:val="22"/>
                 <w:szCs w:val="22"/>
               </w:rPr>
-              <w:t>No accessible admin category-management functionality is currently implemented.</w:t>
+              <w:t>Category management is not currently available through the admin UI.</w:t>
             </w:r>
           </w:p>
         </w:tc>
@@ -3611,35 +3816,7 @@
                 <w:sz w:val="22"/>
                 <w:szCs w:val="22"/>
               </w:rPr>
-              <w:t xml:space="preserve">Logged in as an administrator and opened the </w:t>
-            </w:r>
-            <w:r>
-              <w:rPr>
-                <w:sz w:val="22"/>
-                <w:szCs w:val="22"/>
-              </w:rPr>
-              <w:t>admin</w:t>
-            </w:r>
-            <w:r>
-              <w:rPr>
-                <w:sz w:val="22"/>
-                <w:szCs w:val="22"/>
-              </w:rPr>
-              <w:t xml:space="preserve"> dashboard. The page displayed only </w:t>
-            </w:r>
-            <w:r>
-              <w:rPr>
-                <w:sz w:val="22"/>
-                <w:szCs w:val="22"/>
-              </w:rPr>
-              <w:t>"S9 — placeholder page." No inventory, stock, qua</w:t>
-            </w:r>
-            <w:r>
-              <w:rPr>
-                <w:sz w:val="22"/>
-                <w:szCs w:val="22"/>
-              </w:rPr>
-              <w:t>ntity, or adjustment controls were available.</w:t>
+              <w:t>Logged in as an administrator and inspected the product table. Existing products displayed stock information, and the edit functionality allowed the stock quantity to be changed.</w:t>
             </w:r>
           </w:p>
         </w:tc>
@@ -3659,7 +3836,7 @@
                 <w:sz w:val="22"/>
                 <w:szCs w:val="22"/>
               </w:rPr>
-              <w:t>Administrator cannot view or adjust inventory through the UI.</w:t>
+              <w:t>Administrators can view product stock levels and adjust the stock quantity through the product-management interface.</w:t>
             </w:r>
           </w:p>
         </w:tc>
@@ -3679,7 +3856,7 @@
                 <w:sz w:val="22"/>
                 <w:szCs w:val="22"/>
               </w:rPr>
-              <w:t>Fail / Not implemented</w:t>
+              <w:t>Pass</w:t>
             </w:r>
           </w:p>
         </w:tc>
@@ -3699,7 +3876,7 @@
                 <w:sz w:val="22"/>
                 <w:szCs w:val="22"/>
               </w:rPr>
-              <w:t>Admin dashboard is currently a placeholder and provides no inventory-management functionality.</w:t>
+              <w:t>Inventory viewing and stock adjustment are available to administrators. No test change was saved.</w:t>
             </w:r>
           </w:p>
         </w:tc>
@@ -3771,35 +3948,7 @@
                 <w:sz w:val="22"/>
                 <w:szCs w:val="22"/>
               </w:rPr>
-              <w:t xml:space="preserve">Logged in as an administrator and opened the </w:t>
-            </w:r>
-            <w:r>
-              <w:rPr>
-                <w:sz w:val="22"/>
-                <w:szCs w:val="22"/>
-              </w:rPr>
-              <w:t>admin</w:t>
-            </w:r>
-            <w:r>
-              <w:rPr>
-                <w:sz w:val="22"/>
-                <w:szCs w:val="22"/>
-              </w:rPr>
-              <w:t xml:space="preserve"> dashboard. The page displayed only </w:t>
-            </w:r>
-            <w:r>
-              <w:rPr>
-                <w:sz w:val="22"/>
-                <w:szCs w:val="22"/>
-              </w:rPr>
-              <w:t>"S9 — placeholder page." No customer-order list o</w:t>
-            </w:r>
-            <w:r>
-              <w:rPr>
-                <w:sz w:val="22"/>
-                <w:szCs w:val="22"/>
-              </w:rPr>
-              <w:t>r order-management interface was available.</w:t>
+              <w:t>Logged in as an administrator and checked the order-management area. No orders were available because the customer checkout cannot currently place an order.</w:t>
             </w:r>
           </w:p>
         </w:tc>
@@ -3819,7 +3968,7 @@
                 <w:sz w:val="22"/>
                 <w:szCs w:val="22"/>
               </w:rPr>
-              <w:t>Administrator cannot view customer orders through the UI.</w:t>
+              <w:t>No customer orders are currently available to display because an order cannot be created through the customer checkout flow.</w:t>
             </w:r>
           </w:p>
         </w:tc>
@@ -3839,7 +3988,7 @@
                 <w:sz w:val="22"/>
                 <w:szCs w:val="22"/>
               </w:rPr>
-              <w:t>Fail / Not implemented</w:t>
+              <w:t>Unable to verify</w:t>
             </w:r>
           </w:p>
         </w:tc>
@@ -3859,7 +4008,7 @@
                 <w:sz w:val="22"/>
                 <w:szCs w:val="22"/>
               </w:rPr>
-              <w:t>Admin dashboard is currently a placeholder and provides no customer-order viewing functionality.</w:t>
+              <w:t>End-to-end verification requires at least one existing customer order. The current checkout limitation prevents creating one through the UI.</w:t>
             </w:r>
           </w:p>
         </w:tc>
@@ -3884,7 +4033,6 @@
                 <w:sz w:val="22"/>
                 <w:szCs w:val="22"/>
               </w:rPr>
-              <w:lastRenderedPageBreak/>
               <w:t>FR-A</w:t>
             </w:r>
             <w:r>
@@ -3932,21 +4080,7 @@
                 <w:sz w:val="22"/>
                 <w:szCs w:val="22"/>
               </w:rPr>
-              <w:t xml:space="preserve">Logged in as an administrator and opened the </w:t>
-            </w:r>
-            <w:r>
-              <w:rPr>
-                <w:sz w:val="22"/>
-                <w:szCs w:val="22"/>
-              </w:rPr>
-              <w:t>admin</w:t>
-            </w:r>
-            <w:r>
-              <w:rPr>
-                <w:sz w:val="22"/>
-                <w:szCs w:val="22"/>
-              </w:rPr>
-              <w:t xml:space="preserve"> dashboard. The page displayed only "S9 — placeholder page." No customer-order list or order-status management controls were available.</w:t>
+              <w:t>Logged in as an administrator and inspected the available admin functionality. No order-status management controls were available.</w:t>
             </w:r>
           </w:p>
         </w:tc>
@@ -3966,7 +4100,7 @@
                 <w:sz w:val="22"/>
                 <w:szCs w:val="22"/>
               </w:rPr>
-              <w:t>Administrator cannot update order statuses through the UI.</w:t>
+              <w:t>The admin interface does not provide functionality for updating customer order statuses.</w:t>
             </w:r>
           </w:p>
         </w:tc>
@@ -4006,28 +4140,7 @@
                 <w:sz w:val="22"/>
                 <w:szCs w:val="22"/>
               </w:rPr>
-              <w:t xml:space="preserve">Order management is unavailable because the </w:t>
-            </w:r>
-            <w:r>
-              <w:rPr>
-                <w:sz w:val="22"/>
-                <w:szCs w:val="22"/>
-              </w:rPr>
-              <w:t>admin</w:t>
-            </w:r>
-            <w:r>
-              <w:rPr>
-                <w:sz w:val="22"/>
-                <w:szCs w:val="22"/>
-              </w:rPr>
-              <w:t xml:space="preserve"> dashboard is currently a placeholder</w:t>
-            </w:r>
-            <w:r>
-              <w:rPr>
-                <w:sz w:val="22"/>
-                <w:szCs w:val="22"/>
-              </w:rPr>
-              <w:t>.</w:t>
+              <w:t>Order-status management is not currently implemented in the admin UI.</w:t>
             </w:r>
           </w:p>
         </w:tc>
@@ -4052,6 +4165,7 @@
                 <w:sz w:val="22"/>
                 <w:szCs w:val="22"/>
               </w:rPr>
+              <w:lastRenderedPageBreak/>
               <w:t>FR-A</w:t>
             </w:r>
             <w:r>
@@ -4099,21 +4213,7 @@
                 <w:sz w:val="22"/>
                 <w:szCs w:val="22"/>
               </w:rPr>
-              <w:t xml:space="preserve">Logged in as an administrator and opened the </w:t>
-            </w:r>
-            <w:r>
-              <w:rPr>
-                <w:sz w:val="22"/>
-                <w:szCs w:val="22"/>
-              </w:rPr>
-              <w:t>admin</w:t>
-            </w:r>
-            <w:r>
-              <w:rPr>
-                <w:sz w:val="22"/>
-                <w:szCs w:val="22"/>
-              </w:rPr>
-              <w:t xml:space="preserve"> dashboard. The page displayed only "S9 — placeholder page." No customer reviews, review-management interface, or moderation controls were available.</w:t>
+              <w:t>Logged in as an administrator and inspected the reviews section. The system reported that there are currently 0 reviews.</w:t>
             </w:r>
           </w:p>
         </w:tc>
@@ -4133,7 +4233,7 @@
                 <w:sz w:val="22"/>
                 <w:szCs w:val="22"/>
               </w:rPr>
-              <w:t>Administrator cannot view or moderate customer reviews through the UI.</w:t>
+              <w:t>The admin review area currently contains zero reviews, so review moderation could not be exercised.</w:t>
             </w:r>
           </w:p>
         </w:tc>
@@ -4153,7 +4253,7 @@
                 <w:sz w:val="22"/>
                 <w:szCs w:val="22"/>
               </w:rPr>
-              <w:t>Fail / Not implemented</w:t>
+              <w:t>Unable to verify</w:t>
             </w:r>
           </w:p>
         </w:tc>
@@ -4173,7 +4273,7 @@
                 <w:sz w:val="22"/>
                 <w:szCs w:val="22"/>
               </w:rPr>
-              <w:t>Admin dashboard is currently a placeholder and provides no customer-review moderation functionality.</w:t>
+              <w:t>End-to-end moderation requires at least one customer review. A review cannot currently be created through the normal customer flow because review submission requires a completed purchase, while checkout cannot currently place orders.</w:t>
             </w:r>
           </w:p>
         </w:tc>
@@ -4348,1761 +4448,6 @@
                 <w:szCs w:val="22"/>
               </w:rPr>
               <w:t>Access-control behaviour correctly distinguishes guests, regular customers, and administrators.</w:t>
-            </w:r>
-          </w:p>
-        </w:tc>
-      </w:tr>
-      <w:tr>
-        <w:trPr>
-          <w:jc w:val="center"/>
-        </w:trPr>
-        <w:tc>
-          <w:tcPr>
-            <w:tcW w:w="972" w:type="dxa"/>
-          </w:tcPr>
-          <w:p>
-            <w:pPr>
-              <w:rPr>
-                <w:sz w:val="22"/>
-                <w:szCs w:val="22"/>
-              </w:rPr>
-            </w:pPr>
-            <w:r>
-              <w:rPr>
-                <w:sz w:val="22"/>
-                <w:szCs w:val="22"/>
-              </w:rPr>
-              <w:t>NFR1</w:t>
-            </w:r>
-          </w:p>
-        </w:tc>
-        <w:tc>
-          <w:tcPr>
-            <w:tcW w:w="2142" w:type="dxa"/>
-          </w:tcPr>
-          <w:p>
-            <w:pPr>
-              <w:rPr>
-                <w:sz w:val="22"/>
-                <w:szCs w:val="22"/>
-              </w:rPr>
-            </w:pPr>
-            <w:r>
-              <w:rPr>
-                <w:sz w:val="22"/>
-                <w:szCs w:val="22"/>
-              </w:rPr>
-              <w:t>The system will provide a clear and intuitive interface that allows users to navigate the store easily.</w:t>
-            </w:r>
-          </w:p>
-        </w:tc>
-        <w:tc>
-          <w:tcPr>
-            <w:tcW w:w="4874" w:type="dxa"/>
-          </w:tcPr>
-          <w:p>
-            <w:pPr>
-              <w:rPr>
-                <w:sz w:val="22"/>
-                <w:szCs w:val="22"/>
-              </w:rPr>
-            </w:pPr>
-            <w:r>
-              <w:rPr>
-                <w:sz w:val="22"/>
-                <w:szCs w:val="22"/>
-              </w:rPr>
-              <w:t>Navigated through the application as a guest, customer, and administrator. Main navigation was clear and consistent, and terminology/layout were consistent. However, some interactive headings/controls did not change the mouse cursor to indicate they were clickable. The system also displayed error feedback such as "Failed to fetch" and required refreshing the Catalogue when the API was unavailable.</w:t>
-            </w:r>
-          </w:p>
-        </w:tc>
-        <w:tc>
-          <w:tcPr>
-            <w:tcW w:w="2639" w:type="dxa"/>
-          </w:tcPr>
-          <w:p>
-            <w:pPr>
-              <w:rPr>
-                <w:sz w:val="22"/>
-                <w:szCs w:val="22"/>
-              </w:rPr>
-            </w:pPr>
-            <w:r>
-              <w:rPr>
-                <w:sz w:val="22"/>
-                <w:szCs w:val="22"/>
-              </w:rPr>
-              <w:t>Interface is generally navigable and consistent, but some interaction cues and error/feedback behaviour reduce usability.</w:t>
-            </w:r>
-          </w:p>
-        </w:tc>
-        <w:tc>
-          <w:tcPr>
-            <w:tcW w:w="1417" w:type="dxa"/>
-          </w:tcPr>
-          <w:p>
-            <w:pPr>
-              <w:rPr>
-                <w:sz w:val="22"/>
-                <w:szCs w:val="22"/>
-              </w:rPr>
-            </w:pPr>
-            <w:r>
-              <w:rPr>
-                <w:sz w:val="22"/>
-                <w:szCs w:val="22"/>
-              </w:rPr>
-              <w:t>Partial</w:t>
-            </w:r>
-          </w:p>
-        </w:tc>
-        <w:tc>
-          <w:tcPr>
-            <w:tcW w:w="2693" w:type="dxa"/>
-          </w:tcPr>
-          <w:p>
-            <w:pPr>
-              <w:rPr>
-                <w:sz w:val="22"/>
-                <w:szCs w:val="22"/>
-              </w:rPr>
-            </w:pPr>
-            <w:r>
-              <w:rPr>
-                <w:sz w:val="22"/>
-                <w:szCs w:val="22"/>
-              </w:rPr>
-              <w:t>Navigation and consistency passed, but clickable elements should provide clearer interaction cues and error states could be improved.</w:t>
-            </w:r>
-          </w:p>
-        </w:tc>
-      </w:tr>
-      <w:tr>
-        <w:trPr>
-          <w:jc w:val="center"/>
-        </w:trPr>
-        <w:tc>
-          <w:tcPr>
-            <w:tcW w:w="972" w:type="dxa"/>
-          </w:tcPr>
-          <w:p>
-            <w:pPr>
-              <w:rPr>
-                <w:sz w:val="22"/>
-                <w:szCs w:val="22"/>
-              </w:rPr>
-            </w:pPr>
-            <w:r>
-              <w:rPr>
-                <w:sz w:val="22"/>
-                <w:szCs w:val="22"/>
-              </w:rPr>
-              <w:t>NFR</w:t>
-            </w:r>
-            <w:r>
-              <w:rPr>
-                <w:sz w:val="22"/>
-                <w:szCs w:val="22"/>
-              </w:rPr>
-              <w:t>2</w:t>
-            </w:r>
-          </w:p>
-        </w:tc>
-        <w:tc>
-          <w:tcPr>
-            <w:tcW w:w="2142" w:type="dxa"/>
-          </w:tcPr>
-          <w:p>
-            <w:pPr>
-              <w:rPr>
-                <w:sz w:val="22"/>
-                <w:szCs w:val="22"/>
-              </w:rPr>
-            </w:pPr>
-            <w:r>
-              <w:rPr>
-                <w:sz w:val="22"/>
-                <w:szCs w:val="22"/>
-              </w:rPr>
-              <w:t>The system will respond to normal user interactions within an acceptable amount of time.</w:t>
-            </w:r>
-          </w:p>
-        </w:tc>
-        <w:tc>
-          <w:tcPr>
-            <w:tcW w:w="4874" w:type="dxa"/>
-          </w:tcPr>
-          <w:p>
-            <w:pPr>
-              <w:rPr>
-                <w:sz w:val="22"/>
-                <w:szCs w:val="22"/>
-              </w:rPr>
-            </w:pPr>
-            <w:r>
-              <w:rPr>
-                <w:sz w:val="22"/>
-                <w:szCs w:val="22"/>
-              </w:rPr>
-              <w:t>Measured the Catalogue products API request twice using Edge Developer Tools. The first request took 2.48 seconds and the second took 1.33 seconds. Returning to the Catalogue also resulted in a noticeable loading period. Cart and Orders could not provide meaningful performance measurements because they are placeholder/empty screens.</w:t>
-            </w:r>
-          </w:p>
-        </w:tc>
-        <w:tc>
-          <w:tcPr>
-            <w:tcW w:w="2639" w:type="dxa"/>
-          </w:tcPr>
-          <w:p>
-            <w:pPr>
-              <w:rPr>
-                <w:sz w:val="22"/>
-                <w:szCs w:val="22"/>
-              </w:rPr>
-            </w:pPr>
-            <w:r>
-              <w:rPr>
-                <w:sz w:val="22"/>
-                <w:szCs w:val="22"/>
-              </w:rPr>
-              <w:t>Catalogue response time was variable, ranging from 1.33 to 2.48 seconds. The available evidence was insufficient to determine whether normal system interactions consistently meet an acceptable performance level.</w:t>
-            </w:r>
-          </w:p>
-        </w:tc>
-        <w:tc>
-          <w:tcPr>
-            <w:tcW w:w="1417" w:type="dxa"/>
-          </w:tcPr>
-          <w:p>
-            <w:pPr>
-              <w:rPr>
-                <w:sz w:val="22"/>
-                <w:szCs w:val="22"/>
-              </w:rPr>
-            </w:pPr>
-            <w:r>
-              <w:rPr>
-                <w:sz w:val="22"/>
-                <w:szCs w:val="22"/>
-              </w:rPr>
-              <w:t>Unable to verify</w:t>
-            </w:r>
-          </w:p>
-        </w:tc>
-        <w:tc>
-          <w:tcPr>
-            <w:tcW w:w="2693" w:type="dxa"/>
-          </w:tcPr>
-          <w:p>
-            <w:pPr>
-              <w:rPr>
-                <w:sz w:val="22"/>
-                <w:szCs w:val="22"/>
-              </w:rPr>
-            </w:pPr>
-            <w:r>
-              <w:rPr>
-                <w:sz w:val="22"/>
-                <w:szCs w:val="22"/>
-              </w:rPr>
-              <w:t>Performance could not be fully verified because there is no defined performance threshold in the requirements and several screens contain placeholder/empty functionality.</w:t>
-            </w:r>
-          </w:p>
-        </w:tc>
-      </w:tr>
-      <w:tr>
-        <w:trPr>
-          <w:jc w:val="center"/>
-        </w:trPr>
-        <w:tc>
-          <w:tcPr>
-            <w:tcW w:w="972" w:type="dxa"/>
-          </w:tcPr>
-          <w:p>
-            <w:pPr>
-              <w:rPr>
-                <w:sz w:val="22"/>
-                <w:szCs w:val="22"/>
-              </w:rPr>
-            </w:pPr>
-            <w:r>
-              <w:rPr>
-                <w:sz w:val="22"/>
-                <w:szCs w:val="22"/>
-              </w:rPr>
-              <w:lastRenderedPageBreak/>
-              <w:t>NFR</w:t>
-            </w:r>
-            <w:r>
-              <w:rPr>
-                <w:sz w:val="22"/>
-                <w:szCs w:val="22"/>
-              </w:rPr>
-              <w:t>3</w:t>
-            </w:r>
-          </w:p>
-        </w:tc>
-        <w:tc>
-          <w:tcPr>
-            <w:tcW w:w="2142" w:type="dxa"/>
-          </w:tcPr>
-          <w:p>
-            <w:pPr>
-              <w:rPr>
-                <w:sz w:val="22"/>
-                <w:szCs w:val="22"/>
-              </w:rPr>
-            </w:pPr>
-            <w:r>
-              <w:rPr>
-                <w:sz w:val="22"/>
-                <w:szCs w:val="22"/>
-              </w:rPr>
-              <w:t>The system will protect user information and restrict access to functionality according to user roles.</w:t>
-            </w:r>
-          </w:p>
-        </w:tc>
-        <w:tc>
-          <w:tcPr>
-            <w:tcW w:w="4874" w:type="dxa"/>
-          </w:tcPr>
-          <w:p>
-            <w:pPr>
-              <w:rPr>
-                <w:sz w:val="22"/>
-                <w:szCs w:val="22"/>
-              </w:rPr>
-            </w:pPr>
-            <w:r>
-              <w:rPr>
-                <w:sz w:val="22"/>
-                <w:szCs w:val="22"/>
-              </w:rPr>
-              <w:t>Tested protected routes as a guest, authenticated customer, and authenticated administrator. Guests were redirected to Login when accessing /cart, /orders, and /admin. Authenticated customers could access /cart and /orders but were prevented from accessing /admin. Authenticated administrators could access /admin.</w:t>
-            </w:r>
-          </w:p>
-        </w:tc>
-        <w:tc>
-          <w:tcPr>
-            <w:tcW w:w="2639" w:type="dxa"/>
-          </w:tcPr>
-          <w:p>
-            <w:pPr>
-              <w:rPr>
-                <w:sz w:val="22"/>
-                <w:szCs w:val="22"/>
-              </w:rPr>
-            </w:pPr>
-            <w:r>
-              <w:rPr>
-                <w:sz w:val="22"/>
-                <w:szCs w:val="22"/>
-              </w:rPr>
-              <w:t>Protected customer routes require authentication, and administrative functionality is restricted to authenticated administrators.</w:t>
-            </w:r>
-          </w:p>
-        </w:tc>
-        <w:tc>
-          <w:tcPr>
-            <w:tcW w:w="1417" w:type="dxa"/>
-          </w:tcPr>
-          <w:p>
-            <w:pPr>
-              <w:rPr>
-                <w:sz w:val="22"/>
-                <w:szCs w:val="22"/>
-              </w:rPr>
-            </w:pPr>
-            <w:r>
-              <w:rPr>
-                <w:sz w:val="22"/>
-                <w:szCs w:val="22"/>
-              </w:rPr>
-              <w:t xml:space="preserve">Pass </w:t>
-            </w:r>
-          </w:p>
-        </w:tc>
-        <w:tc>
-          <w:tcPr>
-            <w:tcW w:w="2693" w:type="dxa"/>
-          </w:tcPr>
-          <w:p>
-            <w:pPr>
-              <w:rPr>
-                <w:sz w:val="22"/>
-                <w:szCs w:val="22"/>
-              </w:rPr>
-            </w:pPr>
-            <w:r>
-              <w:rPr>
-                <w:sz w:val="22"/>
-                <w:szCs w:val="22"/>
-              </w:rPr>
-              <w:t>Authentication and role-based route restrictions worked as expected.</w:t>
-            </w:r>
-          </w:p>
-        </w:tc>
-      </w:tr>
-      <w:tr>
-        <w:trPr>
-          <w:jc w:val="center"/>
-        </w:trPr>
-        <w:tc>
-          <w:tcPr>
-            <w:tcW w:w="972" w:type="dxa"/>
-          </w:tcPr>
-          <w:p>
-            <w:pPr>
-              <w:rPr>
-                <w:sz w:val="22"/>
-                <w:szCs w:val="22"/>
-              </w:rPr>
-            </w:pPr>
-            <w:r>
-              <w:rPr>
-                <w:sz w:val="22"/>
-                <w:szCs w:val="22"/>
-              </w:rPr>
-              <w:t>NFR</w:t>
-            </w:r>
-            <w:r>
-              <w:rPr>
-                <w:sz w:val="22"/>
-                <w:szCs w:val="22"/>
-              </w:rPr>
-              <w:t>4</w:t>
-            </w:r>
-          </w:p>
-        </w:tc>
-        <w:tc>
-          <w:tcPr>
-            <w:tcW w:w="2142" w:type="dxa"/>
-          </w:tcPr>
-          <w:p>
-            <w:pPr>
-              <w:rPr>
-                <w:sz w:val="22"/>
-                <w:szCs w:val="22"/>
-              </w:rPr>
-            </w:pPr>
-            <w:r>
-              <w:rPr>
-                <w:sz w:val="22"/>
-                <w:szCs w:val="22"/>
-              </w:rPr>
-              <w:t>The system will process operations without unintended data loss.</w:t>
-            </w:r>
-          </w:p>
-        </w:tc>
-        <w:tc>
-          <w:tcPr>
-            <w:tcW w:w="4874" w:type="dxa"/>
-          </w:tcPr>
-          <w:p>
-            <w:pPr>
-              <w:rPr>
-                <w:sz w:val="22"/>
-                <w:szCs w:val="22"/>
-              </w:rPr>
-            </w:pPr>
-            <w:r>
-              <w:rPr>
-                <w:sz w:val="22"/>
-                <w:szCs w:val="22"/>
-              </w:rPr>
-              <w:t>Repeatedly logged in and out using both customer and administrator accounts. Authentication state and account access remained functional after repeated login/logout operations. Catalogue data also remained available when navigating away from and returning to the Catalogue. Other data-modifying operations such as cart, orders, payments, products, and reviews could not be fully tested because the corresponding UI functionality is not yet implemented.</w:t>
-            </w:r>
-          </w:p>
-        </w:tc>
-        <w:tc>
-          <w:tcPr>
-            <w:tcW w:w="2639" w:type="dxa"/>
-          </w:tcPr>
-          <w:p>
-            <w:pPr>
-              <w:rPr>
-                <w:sz w:val="22"/>
-                <w:szCs w:val="22"/>
-              </w:rPr>
-            </w:pPr>
-            <w:r>
-              <w:rPr>
-                <w:sz w:val="22"/>
-                <w:szCs w:val="22"/>
-              </w:rPr>
-              <w:t>Implemented authentication and catalogue functionality operated reliably during testing, with no observed loss of account access or catalogue data. Full reliability could not be verified across the system because several data operations are not implemented.</w:t>
-            </w:r>
-          </w:p>
-        </w:tc>
-        <w:tc>
-          <w:tcPr>
-            <w:tcW w:w="1417" w:type="dxa"/>
-          </w:tcPr>
-          <w:p>
-            <w:pPr>
-              <w:rPr>
-                <w:sz w:val="22"/>
-                <w:szCs w:val="22"/>
-              </w:rPr>
-            </w:pPr>
-            <w:r>
-              <w:rPr>
-                <w:sz w:val="22"/>
-                <w:szCs w:val="22"/>
-              </w:rPr>
-              <w:t>Partial</w:t>
-            </w:r>
-          </w:p>
-        </w:tc>
-        <w:tc>
-          <w:tcPr>
-            <w:tcW w:w="2693" w:type="dxa"/>
-          </w:tcPr>
-          <w:p>
-            <w:pPr>
-              <w:rPr>
-                <w:sz w:val="22"/>
-                <w:szCs w:val="22"/>
-              </w:rPr>
-            </w:pPr>
-            <w:r>
-              <w:rPr>
-                <w:sz w:val="22"/>
-                <w:szCs w:val="22"/>
-              </w:rPr>
-              <w:t>Reliability of the implemented functionality was demonstrated, but broader data-loss prevention could not be verified for unimplemented features.</w:t>
-            </w:r>
-          </w:p>
-        </w:tc>
-      </w:tr>
-      <w:tr>
-        <w:trPr>
-          <w:jc w:val="center"/>
-        </w:trPr>
-        <w:tc>
-          <w:tcPr>
-            <w:tcW w:w="972" w:type="dxa"/>
-          </w:tcPr>
-          <w:p>
-            <w:pPr>
-              <w:rPr>
-                <w:sz w:val="22"/>
-                <w:szCs w:val="22"/>
-              </w:rPr>
-            </w:pPr>
-            <w:r>
-              <w:rPr>
-                <w:sz w:val="22"/>
-                <w:szCs w:val="22"/>
-              </w:rPr>
-              <w:t>NFR</w:t>
-            </w:r>
-            <w:r>
-              <w:rPr>
-                <w:sz w:val="22"/>
-                <w:szCs w:val="22"/>
-              </w:rPr>
-              <w:t>5</w:t>
-            </w:r>
-          </w:p>
-        </w:tc>
-        <w:tc>
-          <w:tcPr>
-            <w:tcW w:w="2142" w:type="dxa"/>
-          </w:tcPr>
-          <w:p>
-            <w:pPr>
-              <w:rPr>
-                <w:sz w:val="22"/>
-                <w:szCs w:val="22"/>
-              </w:rPr>
-            </w:pPr>
-            <w:r>
-              <w:rPr>
-                <w:sz w:val="22"/>
-                <w:szCs w:val="22"/>
-              </w:rPr>
-              <w:t>The system will remain accessible and operational whenever the application is available to users, with minimal downtime.</w:t>
-            </w:r>
-          </w:p>
-        </w:tc>
-        <w:tc>
-          <w:tcPr>
-            <w:tcW w:w="4874" w:type="dxa"/>
-          </w:tcPr>
-          <w:p>
-            <w:pPr>
-              <w:rPr>
-                <w:sz w:val="22"/>
-                <w:szCs w:val="22"/>
-              </w:rPr>
-            </w:pPr>
-            <w:r>
-              <w:rPr>
-                <w:sz w:val="22"/>
-                <w:szCs w:val="22"/>
-              </w:rPr>
-              <w:t>Used the application continuously during testing and navigated repeatedly between Home, Catalogue, Cart, Orders, and Admin where applicable. The pages opened successfully without unexpected downtime or availability errors. Customer and administrator sessions remained usable throughout testing.</w:t>
-            </w:r>
-          </w:p>
-        </w:tc>
-        <w:tc>
-          <w:tcPr>
-            <w:tcW w:w="2639" w:type="dxa"/>
-          </w:tcPr>
-          <w:p>
-            <w:pPr>
-              <w:rPr>
-                <w:sz w:val="22"/>
-                <w:szCs w:val="22"/>
-              </w:rPr>
-            </w:pPr>
-            <w:r>
-              <w:rPr>
-                <w:sz w:val="22"/>
-                <w:szCs w:val="22"/>
-              </w:rPr>
-              <w:t>The application remained accessible and operational during the testing session, with no unexpected downtime observed.</w:t>
-            </w:r>
-          </w:p>
-        </w:tc>
-        <w:tc>
-          <w:tcPr>
-            <w:tcW w:w="1417" w:type="dxa"/>
-          </w:tcPr>
-          <w:p>
-            <w:pPr>
-              <w:rPr>
-                <w:sz w:val="22"/>
-                <w:szCs w:val="22"/>
-              </w:rPr>
-            </w:pPr>
-            <w:r>
-              <w:rPr>
-                <w:sz w:val="22"/>
-                <w:szCs w:val="22"/>
-              </w:rPr>
-              <w:t xml:space="preserve">Pass </w:t>
-            </w:r>
-          </w:p>
-        </w:tc>
-        <w:tc>
-          <w:tcPr>
-            <w:tcW w:w="2693" w:type="dxa"/>
-          </w:tcPr>
-          <w:p>
-            <w:pPr>
-              <w:rPr>
-                <w:sz w:val="22"/>
-                <w:szCs w:val="22"/>
-              </w:rPr>
-            </w:pPr>
-            <w:r>
-              <w:rPr>
-                <w:sz w:val="22"/>
-                <w:szCs w:val="22"/>
-              </w:rPr>
-              <w:t>Availability was successfully observed during normal use. The earlier Catalogue error occurred because the development API was not running and was not treated as an application availability failure.</w:t>
-            </w:r>
-          </w:p>
-        </w:tc>
-      </w:tr>
-      <w:tr>
-        <w:trPr>
-          <w:jc w:val="center"/>
-        </w:trPr>
-        <w:tc>
-          <w:tcPr>
-            <w:tcW w:w="972" w:type="dxa"/>
-          </w:tcPr>
-          <w:p>
-            <w:pPr>
-              <w:rPr>
-                <w:sz w:val="22"/>
-                <w:szCs w:val="22"/>
-              </w:rPr>
-            </w:pPr>
-            <w:r>
-              <w:rPr>
-                <w:sz w:val="22"/>
-                <w:szCs w:val="22"/>
-              </w:rPr>
-              <w:t>NFR</w:t>
-            </w:r>
-            <w:r>
-              <w:rPr>
-                <w:sz w:val="22"/>
-                <w:szCs w:val="22"/>
-              </w:rPr>
-              <w:t>6</w:t>
-            </w:r>
-          </w:p>
-        </w:tc>
-        <w:tc>
-          <w:tcPr>
-            <w:tcW w:w="2142" w:type="dxa"/>
-          </w:tcPr>
-          <w:p>
-            <w:pPr>
-              <w:rPr>
-                <w:sz w:val="22"/>
-                <w:szCs w:val="22"/>
-              </w:rPr>
-            </w:pPr>
-            <w:r>
-              <w:rPr>
-                <w:sz w:val="22"/>
-                <w:szCs w:val="22"/>
-              </w:rPr>
-              <w:t xml:space="preserve">The system will be designed to accommodate an increase in users, products, orders and stored data without </w:t>
-            </w:r>
-            <w:r>
-              <w:rPr>
-                <w:sz w:val="22"/>
-                <w:szCs w:val="22"/>
-              </w:rPr>
-              <w:lastRenderedPageBreak/>
-              <w:t>requiring major changes to the application's core functionality.</w:t>
-            </w:r>
-          </w:p>
-        </w:tc>
-        <w:tc>
-          <w:tcPr>
-            <w:tcW w:w="4874" w:type="dxa"/>
-          </w:tcPr>
-          <w:p>
-            <w:pPr>
-              <w:rPr>
-                <w:sz w:val="22"/>
-                <w:szCs w:val="22"/>
-              </w:rPr>
-            </w:pPr>
-            <w:r>
-              <w:rPr>
-                <w:sz w:val="22"/>
-                <w:szCs w:val="22"/>
-              </w:rPr>
-              <w:lastRenderedPageBreak/>
-              <w:t xml:space="preserve">Reviewed the implemented architecture and tested the application with the available catalogue and functionality. The system uses PostgreSQL/Prisma for persistent data storage, a separate Express API, and pagination for API responses. However, no load, </w:t>
-            </w:r>
-            <w:r>
-              <w:rPr>
-                <w:sz w:val="22"/>
-                <w:szCs w:val="22"/>
-              </w:rPr>
-              <w:lastRenderedPageBreak/>
-              <w:t>concurrency, or large-dataset testing was performed.</w:t>
-            </w:r>
-          </w:p>
-        </w:tc>
-        <w:tc>
-          <w:tcPr>
-            <w:tcW w:w="2639" w:type="dxa"/>
-          </w:tcPr>
-          <w:p>
-            <w:pPr>
-              <w:rPr>
-                <w:sz w:val="22"/>
-                <w:szCs w:val="22"/>
-              </w:rPr>
-            </w:pPr>
-            <w:r>
-              <w:rPr>
-                <w:sz w:val="22"/>
-                <w:szCs w:val="22"/>
-              </w:rPr>
-              <w:lastRenderedPageBreak/>
-              <w:t xml:space="preserve">The architecture provides some support for future growth, but scalability under increased users, products, orders, or data could not be </w:t>
-            </w:r>
-            <w:r>
-              <w:rPr>
-                <w:sz w:val="22"/>
-                <w:szCs w:val="22"/>
-              </w:rPr>
-              <w:lastRenderedPageBreak/>
-              <w:t>demonstrated through functional testing.</w:t>
-            </w:r>
-          </w:p>
-        </w:tc>
-        <w:tc>
-          <w:tcPr>
-            <w:tcW w:w="1417" w:type="dxa"/>
-          </w:tcPr>
-          <w:p>
-            <w:pPr>
-              <w:rPr>
-                <w:sz w:val="22"/>
-                <w:szCs w:val="22"/>
-              </w:rPr>
-            </w:pPr>
-            <w:r>
-              <w:rPr>
-                <w:sz w:val="22"/>
-                <w:szCs w:val="22"/>
-              </w:rPr>
-              <w:lastRenderedPageBreak/>
-              <w:t>Unable to verify</w:t>
-            </w:r>
-          </w:p>
-        </w:tc>
-        <w:tc>
-          <w:tcPr>
-            <w:tcW w:w="2693" w:type="dxa"/>
-          </w:tcPr>
-          <w:p>
-            <w:pPr>
-              <w:rPr>
-                <w:sz w:val="22"/>
-                <w:szCs w:val="22"/>
-              </w:rPr>
-            </w:pPr>
-            <w:r>
-              <w:rPr>
-                <w:sz w:val="22"/>
-                <w:szCs w:val="22"/>
-              </w:rPr>
-              <w:t>Proper scalability testing would require larger datasets and/or concurrent-load testing beyond the scope of the current functional audit.</w:t>
-            </w:r>
-          </w:p>
-        </w:tc>
-      </w:tr>
-      <w:tr>
-        <w:trPr>
-          <w:jc w:val="center"/>
-        </w:trPr>
-        <w:tc>
-          <w:tcPr>
-            <w:tcW w:w="972" w:type="dxa"/>
-          </w:tcPr>
-          <w:p>
-            <w:pPr>
-              <w:rPr>
-                <w:sz w:val="22"/>
-                <w:szCs w:val="22"/>
-              </w:rPr>
-            </w:pPr>
-            <w:r>
-              <w:rPr>
-                <w:sz w:val="22"/>
-                <w:szCs w:val="22"/>
-              </w:rPr>
-              <w:t>NFR</w:t>
-            </w:r>
-            <w:r>
-              <w:rPr>
-                <w:sz w:val="22"/>
-                <w:szCs w:val="22"/>
-              </w:rPr>
-              <w:t>7</w:t>
-            </w:r>
-          </w:p>
-        </w:tc>
-        <w:tc>
-          <w:tcPr>
-            <w:tcW w:w="2142" w:type="dxa"/>
-          </w:tcPr>
-          <w:p>
-            <w:pPr>
-              <w:rPr>
-                <w:sz w:val="22"/>
-                <w:szCs w:val="22"/>
-              </w:rPr>
-            </w:pPr>
-            <w:r>
-              <w:rPr>
-                <w:sz w:val="22"/>
-                <w:szCs w:val="22"/>
-              </w:rPr>
-              <w:t>The system will maintain accurate and consistent product, inventory, customer and order data.</w:t>
-            </w:r>
-          </w:p>
-        </w:tc>
-        <w:tc>
-          <w:tcPr>
-            <w:tcW w:w="4874" w:type="dxa"/>
-          </w:tcPr>
-          <w:p>
-            <w:pPr>
-              <w:rPr>
-                <w:sz w:val="22"/>
-                <w:szCs w:val="22"/>
-              </w:rPr>
-            </w:pPr>
-            <w:r>
-              <w:rPr>
-                <w:sz w:val="22"/>
-                <w:szCs w:val="22"/>
-              </w:rPr>
-              <w:t>Reviewed and interacted with the available application data. The Catalogue displayed seeded product information consistently, including product names, categories, player counts, playtime, age ratings, complexity, prices, and stock status. Customer and administrator accounts also remained functional during repeated login/logout testing. However, order, cart, payment, and inventory modification workflows could not be tested because the corresponding functionality is not yet implemented.</w:t>
-            </w:r>
-          </w:p>
-        </w:tc>
-        <w:tc>
-          <w:tcPr>
-            <w:tcW w:w="2639" w:type="dxa"/>
-          </w:tcPr>
-          <w:p>
-            <w:pPr>
-              <w:rPr>
-                <w:sz w:val="22"/>
-                <w:szCs w:val="22"/>
-              </w:rPr>
-            </w:pPr>
-            <w:r>
-              <w:rPr>
-                <w:sz w:val="22"/>
-                <w:szCs w:val="22"/>
-              </w:rPr>
-              <w:t>Product and account data appeared consistent during testing, but data integrity across orders, inventory changes, cart operations, and payments could not be fully verified.</w:t>
-            </w:r>
-          </w:p>
-        </w:tc>
-        <w:tc>
-          <w:tcPr>
-            <w:tcW w:w="1417" w:type="dxa"/>
-          </w:tcPr>
-          <w:p>
-            <w:pPr>
-              <w:rPr>
-                <w:sz w:val="22"/>
-                <w:szCs w:val="22"/>
-              </w:rPr>
-            </w:pPr>
-            <w:r>
-              <w:rPr>
-                <w:sz w:val="22"/>
-                <w:szCs w:val="22"/>
-              </w:rPr>
-              <w:t>Partial</w:t>
-            </w:r>
-          </w:p>
-        </w:tc>
-        <w:tc>
-          <w:tcPr>
-            <w:tcW w:w="2693" w:type="dxa"/>
-          </w:tcPr>
-          <w:p>
-            <w:pPr>
-              <w:rPr>
-                <w:sz w:val="22"/>
-                <w:szCs w:val="22"/>
-              </w:rPr>
-            </w:pPr>
-            <w:r>
-              <w:rPr>
-                <w:sz w:val="22"/>
-                <w:szCs w:val="22"/>
-              </w:rPr>
-              <w:t>Data integrity was demonstrated for the implemented functionality, but broader verification requires the remaining data-modifying features to be implemented.</w:t>
-            </w:r>
-          </w:p>
-        </w:tc>
-      </w:tr>
-      <w:tr>
-        <w:trPr>
-          <w:jc w:val="center"/>
-        </w:trPr>
-        <w:tc>
-          <w:tcPr>
-            <w:tcW w:w="972" w:type="dxa"/>
-          </w:tcPr>
-          <w:p>
-            <w:pPr>
-              <w:rPr>
-                <w:sz w:val="22"/>
-                <w:szCs w:val="22"/>
-              </w:rPr>
-            </w:pPr>
-            <w:r>
-              <w:rPr>
-                <w:sz w:val="22"/>
-                <w:szCs w:val="22"/>
-              </w:rPr>
-              <w:t>NFR</w:t>
-            </w:r>
-            <w:r>
-              <w:rPr>
-                <w:sz w:val="22"/>
-                <w:szCs w:val="22"/>
-              </w:rPr>
-              <w:t>8</w:t>
-            </w:r>
-          </w:p>
-        </w:tc>
-        <w:tc>
-          <w:tcPr>
-            <w:tcW w:w="2142" w:type="dxa"/>
-          </w:tcPr>
-          <w:p>
-            <w:pPr>
-              <w:rPr>
-                <w:sz w:val="22"/>
-                <w:szCs w:val="22"/>
-              </w:rPr>
-            </w:pPr>
-            <w:r>
-              <w:rPr>
-                <w:sz w:val="22"/>
-                <w:szCs w:val="22"/>
-              </w:rPr>
-              <w:t>The system will use a structured architecture that makes the application easier to maintain and modify.</w:t>
-            </w:r>
-          </w:p>
-        </w:tc>
-        <w:tc>
-          <w:tcPr>
-            <w:tcW w:w="4874" w:type="dxa"/>
-          </w:tcPr>
-          <w:p>
-            <w:pPr>
-              <w:rPr>
-                <w:sz w:val="22"/>
-                <w:szCs w:val="22"/>
-              </w:rPr>
-            </w:pPr>
-            <w:r>
-              <w:rPr>
-                <w:sz w:val="22"/>
-                <w:szCs w:val="22"/>
-              </w:rPr>
-              <w:t>Reviewed the implemented project structure and architecture. The application separates the React frontend from the Express backend and uses structured backend layers including controllers, services, repositories, middleware, validation, and Prisma database access. Shared frontend components are reused across screens, and automated tests are organised across application functionality.</w:t>
-            </w:r>
-          </w:p>
-        </w:tc>
-        <w:tc>
-          <w:tcPr>
-            <w:tcW w:w="2639" w:type="dxa"/>
-          </w:tcPr>
-          <w:p>
-            <w:pPr>
-              <w:rPr>
-                <w:sz w:val="22"/>
-                <w:szCs w:val="22"/>
-              </w:rPr>
-            </w:pPr>
-            <w:r>
-              <w:rPr>
-                <w:sz w:val="22"/>
-                <w:szCs w:val="22"/>
-              </w:rPr>
-              <w:t>The application uses a structured and modular architecture with separation of responsibilities and reusable components, supporting maintainability and future modification.</w:t>
-            </w:r>
-          </w:p>
-        </w:tc>
-        <w:tc>
-          <w:tcPr>
-            <w:tcW w:w="1417" w:type="dxa"/>
-          </w:tcPr>
-          <w:p>
-            <w:pPr>
-              <w:rPr>
-                <w:sz w:val="22"/>
-                <w:szCs w:val="22"/>
-              </w:rPr>
-            </w:pPr>
-            <w:r>
-              <w:rPr>
-                <w:sz w:val="22"/>
-                <w:szCs w:val="22"/>
-              </w:rPr>
-              <w:t xml:space="preserve">Pass </w:t>
-            </w:r>
-          </w:p>
-        </w:tc>
-        <w:tc>
-          <w:tcPr>
-            <w:tcW w:w="2693" w:type="dxa"/>
-          </w:tcPr>
-          <w:p>
-            <w:pPr>
-              <w:rPr>
-                <w:sz w:val="22"/>
-                <w:szCs w:val="22"/>
-              </w:rPr>
-            </w:pPr>
-            <w:r>
-              <w:rPr>
-                <w:sz w:val="22"/>
-                <w:szCs w:val="22"/>
-              </w:rPr>
-              <w:t>The architecture and code organisation support maintainability through separation of concerns, reuse, and automated testing.</w:t>
-            </w:r>
-          </w:p>
-        </w:tc>
-      </w:tr>
-      <w:tr>
-        <w:trPr>
-          <w:jc w:val="center"/>
-        </w:trPr>
-        <w:tc>
-          <w:tcPr>
-            <w:tcW w:w="972" w:type="dxa"/>
-          </w:tcPr>
-          <w:p>
-            <w:pPr>
-              <w:rPr>
-                <w:sz w:val="22"/>
-                <w:szCs w:val="22"/>
-              </w:rPr>
-            </w:pPr>
-            <w:r>
-              <w:rPr>
-                <w:sz w:val="22"/>
-                <w:szCs w:val="22"/>
-              </w:rPr>
-              <w:t>NFR</w:t>
-            </w:r>
-            <w:r>
-              <w:rPr>
-                <w:sz w:val="22"/>
-                <w:szCs w:val="22"/>
-              </w:rPr>
-              <w:t>9</w:t>
-            </w:r>
-          </w:p>
-        </w:tc>
-        <w:tc>
-          <w:tcPr>
-            <w:tcW w:w="2142" w:type="dxa"/>
-          </w:tcPr>
-          <w:p>
-            <w:pPr>
-              <w:rPr>
-                <w:sz w:val="22"/>
-                <w:szCs w:val="22"/>
-              </w:rPr>
-            </w:pPr>
-            <w:r>
-              <w:rPr>
-                <w:sz w:val="22"/>
-                <w:szCs w:val="22"/>
-              </w:rPr>
-              <w:t>The system will be accessible and functional across major modern web browsers and operating systems (Windows, macOS, Android and iOS).</w:t>
-            </w:r>
-          </w:p>
-        </w:tc>
-        <w:tc>
-          <w:tcPr>
-            <w:tcW w:w="4874" w:type="dxa"/>
-          </w:tcPr>
-          <w:p>
-            <w:pPr>
-              <w:rPr>
-                <w:sz w:val="22"/>
-                <w:szCs w:val="22"/>
-              </w:rPr>
-            </w:pPr>
-            <w:r>
-              <w:rPr>
-                <w:sz w:val="22"/>
-                <w:szCs w:val="22"/>
-              </w:rPr>
-              <w:t>Tested the application on Windows using Microsoft Edge. Guest, customer, and administrator functionality that has been implemented operated successfully on this platform. No testing was performed on macOS, Android, or iOS, and cross-browser compatibility was not comprehensively tested.</w:t>
-            </w:r>
-          </w:p>
-        </w:tc>
-        <w:tc>
-          <w:tcPr>
-            <w:tcW w:w="2639" w:type="dxa"/>
-          </w:tcPr>
-          <w:p>
-            <w:pPr>
-              <w:rPr>
-                <w:sz w:val="22"/>
-                <w:szCs w:val="22"/>
-              </w:rPr>
-            </w:pPr>
-            <w:r>
-              <w:rPr>
-                <w:sz w:val="22"/>
-                <w:szCs w:val="22"/>
-              </w:rPr>
-              <w:t>The application was functional on Windows/Edge, but compatibility across the other required operating systems and browsers could not be established.</w:t>
-            </w:r>
-          </w:p>
-        </w:tc>
-        <w:tc>
-          <w:tcPr>
-            <w:tcW w:w="1417" w:type="dxa"/>
-          </w:tcPr>
-          <w:p>
-            <w:pPr>
-              <w:rPr>
-                <w:sz w:val="22"/>
-                <w:szCs w:val="22"/>
-              </w:rPr>
-            </w:pPr>
-            <w:r>
-              <w:rPr>
-                <w:sz w:val="22"/>
-                <w:szCs w:val="22"/>
-              </w:rPr>
-              <w:t xml:space="preserve">Unable to </w:t>
-            </w:r>
-            <w:r>
-              <w:rPr>
-                <w:sz w:val="22"/>
-                <w:szCs w:val="22"/>
-              </w:rPr>
-              <w:t>verify</w:t>
-            </w:r>
-          </w:p>
-        </w:tc>
-        <w:tc>
-          <w:tcPr>
-            <w:tcW w:w="2693" w:type="dxa"/>
-          </w:tcPr>
-          <w:p>
-            <w:pPr>
-              <w:rPr>
-                <w:sz w:val="22"/>
-                <w:szCs w:val="22"/>
-              </w:rPr>
-            </w:pPr>
-            <w:r>
-              <w:rPr>
-                <w:sz w:val="22"/>
-                <w:szCs w:val="22"/>
-              </w:rPr>
-              <w:t>Additional testing on macOS, Android, iOS, and other modern browsers would be required to fully verify cross-platform accessibility.</w:t>
-            </w:r>
-          </w:p>
-        </w:tc>
-      </w:tr>
-      <w:tr>
-        <w:trPr>
-          <w:jc w:val="center"/>
-        </w:trPr>
-        <w:tc>
-          <w:tcPr>
-            <w:tcW w:w="972" w:type="dxa"/>
-          </w:tcPr>
-          <w:p>
-            <w:pPr>
-              <w:rPr>
-                <w:sz w:val="22"/>
-                <w:szCs w:val="22"/>
-              </w:rPr>
-            </w:pPr>
-            <w:r>
-              <w:rPr>
-                <w:sz w:val="22"/>
-                <w:szCs w:val="22"/>
-              </w:rPr>
-              <w:lastRenderedPageBreak/>
-              <w:t>NFR1</w:t>
-            </w:r>
-            <w:r>
-              <w:rPr>
-                <w:sz w:val="22"/>
-                <w:szCs w:val="22"/>
-              </w:rPr>
-              <w:t>0</w:t>
-            </w:r>
-          </w:p>
-        </w:tc>
-        <w:tc>
-          <w:tcPr>
-            <w:tcW w:w="2142" w:type="dxa"/>
-          </w:tcPr>
-          <w:p>
-            <w:pPr>
-              <w:rPr>
-                <w:sz w:val="22"/>
-                <w:szCs w:val="22"/>
-              </w:rPr>
-            </w:pPr>
-            <w:r>
-              <w:rPr>
-                <w:sz w:val="22"/>
-                <w:szCs w:val="22"/>
-              </w:rPr>
-              <w:t>The interface will adapt appropriately to different screen sizes.</w:t>
-            </w:r>
-          </w:p>
-        </w:tc>
-        <w:tc>
-          <w:tcPr>
-            <w:tcW w:w="4874" w:type="dxa"/>
-          </w:tcPr>
-          <w:p>
-            <w:pPr>
-              <w:rPr>
-                <w:sz w:val="22"/>
-                <w:szCs w:val="22"/>
-              </w:rPr>
-            </w:pPr>
-            <w:r>
-              <w:rPr>
-                <w:sz w:val="22"/>
-                <w:szCs w:val="22"/>
-              </w:rPr>
-              <w:t xml:space="preserve">Tested the Catalogue at the required 360 </w:t>
-            </w:r>
-            <w:proofErr w:type="spellStart"/>
-            <w:r>
-              <w:rPr>
-                <w:sz w:val="22"/>
-                <w:szCs w:val="22"/>
-              </w:rPr>
-              <w:t>px</w:t>
-            </w:r>
-            <w:proofErr w:type="spellEnd"/>
-            <w:r>
-              <w:rPr>
-                <w:sz w:val="22"/>
-                <w:szCs w:val="22"/>
-              </w:rPr>
-              <w:t xml:space="preserve">, 768 </w:t>
-            </w:r>
-            <w:proofErr w:type="spellStart"/>
-            <w:r>
-              <w:rPr>
-                <w:sz w:val="22"/>
-                <w:szCs w:val="22"/>
-              </w:rPr>
-              <w:t>px</w:t>
-            </w:r>
-            <w:proofErr w:type="spellEnd"/>
-            <w:r>
-              <w:rPr>
-                <w:sz w:val="22"/>
-                <w:szCs w:val="22"/>
-              </w:rPr>
-              <w:t xml:space="preserve">, 1024 </w:t>
-            </w:r>
-            <w:proofErr w:type="spellStart"/>
-            <w:r>
-              <w:rPr>
-                <w:sz w:val="22"/>
-                <w:szCs w:val="22"/>
-              </w:rPr>
-              <w:t>px</w:t>
-            </w:r>
-            <w:proofErr w:type="spellEnd"/>
-            <w:r>
-              <w:rPr>
-                <w:sz w:val="22"/>
-                <w:szCs w:val="22"/>
-              </w:rPr>
-              <w:t xml:space="preserve">, and 1440 </w:t>
-            </w:r>
-            <w:proofErr w:type="spellStart"/>
-            <w:r>
-              <w:rPr>
-                <w:sz w:val="22"/>
-                <w:szCs w:val="22"/>
-              </w:rPr>
-              <w:t>px</w:t>
-            </w:r>
-            <w:proofErr w:type="spellEnd"/>
-            <w:r>
-              <w:rPr>
-                <w:sz w:val="22"/>
-                <w:szCs w:val="22"/>
-              </w:rPr>
-              <w:t xml:space="preserve"> responsive breakpoints using browser device emulation. At 360 </w:t>
-            </w:r>
-            <w:proofErr w:type="spellStart"/>
-            <w:r>
-              <w:rPr>
-                <w:sz w:val="22"/>
-                <w:szCs w:val="22"/>
-              </w:rPr>
-              <w:t>px</w:t>
-            </w:r>
-            <w:proofErr w:type="spellEnd"/>
-            <w:r>
-              <w:rPr>
-                <w:sz w:val="22"/>
-                <w:szCs w:val="22"/>
-              </w:rPr>
-              <w:t xml:space="preserve">, filters appeared above the games with one game per row. At 768 </w:t>
-            </w:r>
-            <w:proofErr w:type="spellStart"/>
-            <w:r>
-              <w:rPr>
-                <w:sz w:val="22"/>
-                <w:szCs w:val="22"/>
-              </w:rPr>
-              <w:t>px</w:t>
-            </w:r>
-            <w:proofErr w:type="spellEnd"/>
-            <w:r>
-              <w:rPr>
-                <w:sz w:val="22"/>
-                <w:szCs w:val="22"/>
-              </w:rPr>
-              <w:t xml:space="preserve">, filters remained above the games with two games per row. At 1024 </w:t>
-            </w:r>
-            <w:proofErr w:type="spellStart"/>
-            <w:r>
-              <w:rPr>
-                <w:sz w:val="22"/>
-                <w:szCs w:val="22"/>
-              </w:rPr>
-              <w:t>px</w:t>
-            </w:r>
-            <w:proofErr w:type="spellEnd"/>
-            <w:r>
-              <w:rPr>
-                <w:sz w:val="22"/>
-                <w:szCs w:val="22"/>
-              </w:rPr>
-              <w:t xml:space="preserve">, filters moved to the left and games displayed on the right in two columns. At 1440 </w:t>
-            </w:r>
-            <w:proofErr w:type="spellStart"/>
-            <w:r>
-              <w:rPr>
-                <w:sz w:val="22"/>
-                <w:szCs w:val="22"/>
-              </w:rPr>
-              <w:t>px</w:t>
-            </w:r>
-            <w:proofErr w:type="spellEnd"/>
-            <w:r>
-              <w:rPr>
-                <w:sz w:val="22"/>
-                <w:szCs w:val="22"/>
-              </w:rPr>
-              <w:t>, filters remained on the left and games displayed on the right in four columns. No overlap, cutoff, or horizontal scrolling was observed.</w:t>
-            </w:r>
-          </w:p>
-        </w:tc>
-        <w:tc>
-          <w:tcPr>
-            <w:tcW w:w="2639" w:type="dxa"/>
-          </w:tcPr>
-          <w:p>
-            <w:pPr>
-              <w:rPr>
-                <w:sz w:val="22"/>
-                <w:szCs w:val="22"/>
-              </w:rPr>
-            </w:pPr>
-            <w:r>
-              <w:rPr>
-                <w:sz w:val="22"/>
-                <w:szCs w:val="22"/>
-              </w:rPr>
-              <w:t>The Catalogue layout adapted appropriately across all required screen sizes, changing the filter placement and number of products per row according to the available screen width.</w:t>
-            </w:r>
-          </w:p>
-        </w:tc>
-        <w:tc>
-          <w:tcPr>
-            <w:tcW w:w="1417" w:type="dxa"/>
-          </w:tcPr>
-          <w:p>
-            <w:pPr>
-              <w:rPr>
-                <w:sz w:val="22"/>
-                <w:szCs w:val="22"/>
-              </w:rPr>
-            </w:pPr>
-            <w:r>
-              <w:rPr>
-                <w:sz w:val="22"/>
-                <w:szCs w:val="22"/>
-              </w:rPr>
-              <w:t xml:space="preserve">Pass </w:t>
-            </w:r>
-          </w:p>
-        </w:tc>
-        <w:tc>
-          <w:tcPr>
-            <w:tcW w:w="2693" w:type="dxa"/>
-          </w:tcPr>
-          <w:p>
-            <w:r>
-              <w:t>Responsive behaviour was successfully demonstrated at all four required breakpoints.</w:t>
-            </w:r>
-          </w:p>
-          <w:p>
-            <w:pPr>
-              <w:rPr>
-                <w:sz w:val="22"/>
-                <w:szCs w:val="22"/>
-              </w:rPr>
-            </w:pPr>
-          </w:p>
-        </w:tc>
-      </w:tr>
-      <w:tr>
-        <w:trPr>
-          <w:jc w:val="center"/>
-        </w:trPr>
-        <w:tc>
-          <w:tcPr>
-            <w:tcW w:w="972" w:type="dxa"/>
-          </w:tcPr>
-          <w:p>
-            <w:pPr>
-              <w:rPr>
-                <w:sz w:val="22"/>
-                <w:szCs w:val="22"/>
-              </w:rPr>
-            </w:pPr>
-            <w:r>
-              <w:rPr>
-                <w:sz w:val="22"/>
-                <w:szCs w:val="22"/>
-              </w:rPr>
-              <w:t>NFR1</w:t>
-            </w:r>
-            <w:r>
-              <w:rPr>
-                <w:sz w:val="22"/>
-                <w:szCs w:val="22"/>
-              </w:rPr>
-              <w:t>1</w:t>
-            </w:r>
-          </w:p>
-        </w:tc>
-        <w:tc>
-          <w:tcPr>
-            <w:tcW w:w="2142" w:type="dxa"/>
-          </w:tcPr>
-          <w:p>
-            <w:pPr>
-              <w:rPr>
-                <w:sz w:val="22"/>
-                <w:szCs w:val="22"/>
-              </w:rPr>
-            </w:pPr>
-            <w:r>
-              <w:rPr>
-                <w:sz w:val="22"/>
-                <w:szCs w:val="22"/>
-              </w:rPr>
-              <w:t>The system will support automated testing of its major components and functionality.</w:t>
-            </w:r>
-          </w:p>
-        </w:tc>
-        <w:tc>
-          <w:tcPr>
-            <w:tcW w:w="4874" w:type="dxa"/>
-          </w:tcPr>
-          <w:p>
-            <w:pPr>
-              <w:rPr>
-                <w:sz w:val="22"/>
-                <w:szCs w:val="22"/>
-              </w:rPr>
-            </w:pPr>
-            <w:r>
-              <w:rPr>
-                <w:sz w:val="22"/>
-                <w:szCs w:val="22"/>
-              </w:rPr>
-              <w:t xml:space="preserve">Ran the automated server test suite from the main branch using </w:t>
-            </w:r>
-            <w:proofErr w:type="spellStart"/>
-            <w:r>
-              <w:rPr>
-                <w:sz w:val="22"/>
-                <w:szCs w:val="22"/>
-              </w:rPr>
-              <w:t>npm</w:t>
-            </w:r>
-            <w:proofErr w:type="spellEnd"/>
-            <w:r>
-              <w:rPr>
-                <w:sz w:val="22"/>
-                <w:szCs w:val="22"/>
-              </w:rPr>
-              <w:t xml:space="preserve"> test. The suite completed successfully with 32 test files passing and 337 individual tests passing, with no failures. Tests cover major application areas including authentication, authorization, middleware, controllers, repositories, services, and routes.</w:t>
-            </w:r>
-          </w:p>
-        </w:tc>
-        <w:tc>
-          <w:tcPr>
-            <w:tcW w:w="2639" w:type="dxa"/>
-          </w:tcPr>
-          <w:p>
-            <w:pPr>
-              <w:rPr>
-                <w:sz w:val="22"/>
-                <w:szCs w:val="22"/>
-              </w:rPr>
-            </w:pPr>
-            <w:r>
-              <w:rPr>
-                <w:sz w:val="22"/>
-                <w:szCs w:val="22"/>
-              </w:rPr>
-              <w:t>The system has an established automated test suite covering major components and functionality, and the complete suite executed successfully.</w:t>
-            </w:r>
-          </w:p>
-        </w:tc>
-        <w:tc>
-          <w:tcPr>
-            <w:tcW w:w="1417" w:type="dxa"/>
-          </w:tcPr>
-          <w:p>
-            <w:pPr>
-              <w:rPr>
-                <w:sz w:val="22"/>
-                <w:szCs w:val="22"/>
-              </w:rPr>
-            </w:pPr>
-            <w:r>
-              <w:rPr>
-                <w:sz w:val="22"/>
-                <w:szCs w:val="22"/>
-              </w:rPr>
-              <w:t xml:space="preserve">Pass </w:t>
-            </w:r>
-          </w:p>
-        </w:tc>
-        <w:tc>
-          <w:tcPr>
-            <w:tcW w:w="2693" w:type="dxa"/>
-          </w:tcPr>
-          <w:p>
-            <w:pPr>
-              <w:rPr>
-                <w:sz w:val="22"/>
-                <w:szCs w:val="22"/>
-              </w:rPr>
-            </w:pPr>
-            <w:r>
-              <w:rPr>
-                <w:sz w:val="22"/>
-                <w:szCs w:val="22"/>
-              </w:rPr>
-              <w:t>Automated testing is implemented using the project's server-side test framework and covers multiple application layers and core functionality.</w:t>
-            </w:r>
-          </w:p>
-        </w:tc>
-      </w:tr>
-      <w:tr>
-        <w:trPr>
-          <w:jc w:val="center"/>
-        </w:trPr>
-        <w:tc>
-          <w:tcPr>
-            <w:tcW w:w="972" w:type="dxa"/>
-          </w:tcPr>
-          <w:p>
-            <w:pPr>
-              <w:rPr>
-                <w:sz w:val="22"/>
-                <w:szCs w:val="22"/>
-              </w:rPr>
-            </w:pPr>
-            <w:r>
-              <w:rPr>
-                <w:sz w:val="22"/>
-                <w:szCs w:val="22"/>
-              </w:rPr>
-              <w:t>NFR1</w:t>
-            </w:r>
-            <w:r>
-              <w:rPr>
-                <w:sz w:val="22"/>
-                <w:szCs w:val="22"/>
-              </w:rPr>
-              <w:t>2</w:t>
-            </w:r>
-          </w:p>
-        </w:tc>
-        <w:tc>
-          <w:tcPr>
-            <w:tcW w:w="2142" w:type="dxa"/>
-          </w:tcPr>
-          <w:p>
-            <w:pPr>
-              <w:rPr>
-                <w:sz w:val="22"/>
-                <w:szCs w:val="22"/>
-              </w:rPr>
-            </w:pPr>
-            <w:r>
-              <w:rPr>
-                <w:sz w:val="22"/>
-                <w:szCs w:val="22"/>
-              </w:rPr>
-              <w:t>The system will provide clear error messages when invalid or incomplete information is submitted.</w:t>
-            </w:r>
-          </w:p>
-        </w:tc>
-        <w:tc>
-          <w:tcPr>
-            <w:tcW w:w="4874" w:type="dxa"/>
-          </w:tcPr>
-          <w:p>
-            <w:pPr>
-              <w:rPr>
-                <w:sz w:val="22"/>
-                <w:szCs w:val="22"/>
-              </w:rPr>
-            </w:pPr>
-            <w:r>
-              <w:rPr>
-                <w:sz w:val="22"/>
-                <w:szCs w:val="22"/>
-              </w:rPr>
-              <w:t>Tested the application during normal use and observed error feedback when operations could not be completed. The application displayed messages such as “Failed to fetch” during registration and “Couldn't load the catalogue. Try refreshing the page.” when the API was unavailable.</w:t>
-            </w:r>
-          </w:p>
-        </w:tc>
-        <w:tc>
-          <w:tcPr>
-            <w:tcW w:w="2639" w:type="dxa"/>
-          </w:tcPr>
-          <w:p>
-            <w:pPr>
-              <w:rPr>
-                <w:sz w:val="22"/>
-                <w:szCs w:val="22"/>
-              </w:rPr>
-            </w:pPr>
-            <w:r>
-              <w:rPr>
-                <w:sz w:val="22"/>
-                <w:szCs w:val="22"/>
-              </w:rPr>
-              <w:t>The system provides error feedback, but some messages are technical or generic and do not clearly explain the problem or the action the user should take.</w:t>
-            </w:r>
-          </w:p>
-        </w:tc>
-        <w:tc>
-          <w:tcPr>
-            <w:tcW w:w="1417" w:type="dxa"/>
-          </w:tcPr>
-          <w:p>
-            <w:pPr>
-              <w:rPr>
-                <w:sz w:val="22"/>
-                <w:szCs w:val="22"/>
-              </w:rPr>
-            </w:pPr>
-            <w:r>
-              <w:rPr>
-                <w:sz w:val="22"/>
-                <w:szCs w:val="22"/>
-              </w:rPr>
-              <w:t>Partial</w:t>
-            </w:r>
-          </w:p>
-        </w:tc>
-        <w:tc>
-          <w:tcPr>
-            <w:tcW w:w="2693" w:type="dxa"/>
-          </w:tcPr>
-          <w:p>
-            <w:pPr>
-              <w:rPr>
-                <w:sz w:val="22"/>
-                <w:szCs w:val="22"/>
-              </w:rPr>
-            </w:pPr>
-            <w:r>
-              <w:rPr>
-                <w:sz w:val="22"/>
-                <w:szCs w:val="22"/>
-              </w:rPr>
-              <w:t>Error handling is present, but messages should be made more user-friendly and informative, particularly for network and validation errors.</w:t>
             </w:r>
           </w:p>
         </w:tc>

</xml_diff>

<commit_message>
docs: correct filter audit results
</commit_message>
<xml_diff>
--- a/docs/#138_Requirements_Audit.docx
+++ b/docs/#138_Requirements_Audit.docx
@@ -294,14 +294,7 @@
                 <w:sz w:val="22"/>
                 <w:szCs w:val="22"/>
               </w:rPr>
-              <w:t>FR-G</w:t>
-            </w:r>
-            <w:r>
-              <w:rPr>
-                <w:sz w:val="22"/>
-                <w:szCs w:val="22"/>
-              </w:rPr>
-              <w:t>2</w:t>
+              <w:t>FR-G2</w:t>
             </w:r>
           </w:p>
         </w:tc>
@@ -341,21 +334,7 @@
                 <w:sz w:val="22"/>
                 <w:szCs w:val="22"/>
               </w:rPr>
-              <w:t>Reviewed the guest Catalogue screen. No search field or search control is available</w:t>
-            </w:r>
-            <w:r>
-              <w:rPr>
-                <w:sz w:val="22"/>
-                <w:szCs w:val="22"/>
-              </w:rPr>
-              <w:t>. T</w:t>
-            </w:r>
-            <w:r>
-              <w:rPr>
-                <w:sz w:val="22"/>
-                <w:szCs w:val="22"/>
-              </w:rPr>
-              <w:t>he screen provides filtering controls only.</w:t>
+              <w:t>Reviewed the guest Catalogue screen. No search field or search control is available. The screen provides filtering controls only.</w:t>
             </w:r>
           </w:p>
         </w:tc>
@@ -440,14 +419,7 @@
                 <w:sz w:val="22"/>
                 <w:szCs w:val="22"/>
               </w:rPr>
-              <w:t>FR-G</w:t>
-            </w:r>
-            <w:r>
-              <w:rPr>
-                <w:sz w:val="22"/>
-                <w:szCs w:val="22"/>
-              </w:rPr>
-              <w:t>3</w:t>
+              <w:t>FR-G3</w:t>
             </w:r>
           </w:p>
         </w:tc>
@@ -507,71 +479,8 @@
                 <w:sz w:val="22"/>
                 <w:szCs w:val="22"/>
               </w:rPr>
-              <w:t>F</w:t>
-            </w:r>
-            <w:r>
-              <w:rPr>
-                <w:sz w:val="22"/>
-                <w:szCs w:val="22"/>
-              </w:rPr>
-              <w:t xml:space="preserve">ilter partially changes the displayed results, but the results are not correctly restricted to the selected attribute. For example, selecting the </w:t>
-            </w:r>
-            <w:r>
-              <w:rPr>
-                <w:i/>
-                <w:iCs/>
-                <w:sz w:val="22"/>
-                <w:szCs w:val="22"/>
-              </w:rPr>
-              <w:t>Card Game</w:t>
-            </w:r>
-            <w:r>
-              <w:rPr>
-                <w:sz w:val="22"/>
-                <w:szCs w:val="22"/>
-              </w:rPr>
-              <w:t xml:space="preserve"> category still displays games associated with other categories such as </w:t>
-            </w:r>
-            <w:r>
-              <w:rPr>
-                <w:i/>
-                <w:iCs/>
-                <w:sz w:val="22"/>
-                <w:szCs w:val="22"/>
-              </w:rPr>
-              <w:t>Strategy</w:t>
-            </w:r>
-            <w:r>
-              <w:rPr>
-                <w:sz w:val="22"/>
-                <w:szCs w:val="22"/>
-              </w:rPr>
-              <w:t xml:space="preserve"> and </w:t>
-            </w:r>
-            <w:r>
-              <w:rPr>
-                <w:i/>
-                <w:iCs/>
-                <w:sz w:val="22"/>
-                <w:szCs w:val="22"/>
-              </w:rPr>
-              <w:t>Family</w:t>
-            </w:r>
-            <w:r>
-              <w:rPr>
-                <w:sz w:val="22"/>
-                <w:szCs w:val="22"/>
-              </w:rPr>
-              <w:t xml:space="preserve">. </w:t>
-            </w:r>
-          </w:p>
-          <w:p>
-            <w:pPr>
-              <w:rPr>
-                <w:sz w:val="22"/>
-                <w:szCs w:val="22"/>
-              </w:rPr>
-            </w:pPr>
+              <w:t>Category filtering works correctly, including products assigned to multiple categories.</w:t>
+            </w:r>
           </w:p>
         </w:tc>
         <w:tc>
@@ -590,7 +499,7 @@
                 <w:sz w:val="22"/>
                 <w:szCs w:val="22"/>
               </w:rPr>
-              <w:t>Partial</w:t>
+              <w:t xml:space="preserve">Pass </w:t>
             </w:r>
           </w:p>
         </w:tc>
@@ -610,7 +519,7 @@
                 <w:sz w:val="22"/>
                 <w:szCs w:val="22"/>
               </w:rPr>
-              <w:t>Filter controls are present and affect the number of displayed products, but filtering does not correctly restrict results to the selected category.</w:t>
+              <w:t>Products can legitimately belong to multiple categories. For example, Dominion appears under both Card Games and Strategy. This is expected filtering behaviour rather than a defect.</w:t>
             </w:r>
           </w:p>
         </w:tc>
@@ -635,14 +544,7 @@
                 <w:sz w:val="22"/>
                 <w:szCs w:val="22"/>
               </w:rPr>
-              <w:t>FR-G</w:t>
-            </w:r>
-            <w:r>
-              <w:rPr>
-                <w:sz w:val="22"/>
-                <w:szCs w:val="22"/>
-              </w:rPr>
-              <w:t>4</w:t>
+              <w:t>FR-G4</w:t>
             </w:r>
           </w:p>
         </w:tc>
@@ -767,14 +669,7 @@
                 <w:sz w:val="22"/>
                 <w:szCs w:val="22"/>
               </w:rPr>
-              <w:t>FR-G</w:t>
-            </w:r>
-            <w:r>
-              <w:rPr>
-                <w:sz w:val="22"/>
-                <w:szCs w:val="22"/>
-              </w:rPr>
-              <w:t>5</w:t>
+              <w:t>FR-G5</w:t>
             </w:r>
           </w:p>
         </w:tc>
@@ -814,15 +709,7 @@
                 <w:sz w:val="22"/>
                 <w:szCs w:val="22"/>
               </w:rPr>
-              <w:t xml:space="preserve">Opened Register as a guest, completed the required registration fields with a valid password, submitted </w:t>
-            </w:r>
-            <w:r>
-              <w:rPr>
-                <w:sz w:val="22"/>
-                <w:szCs w:val="22"/>
-              </w:rPr>
-              <w:lastRenderedPageBreak/>
-              <w:t>the form, and was successfully admitted into the application as the newly registered user.</w:t>
+              <w:t>Opened Register as a guest, completed the required registration fields with a valid password, submitted the form, and was successfully admitted into the application as the newly registered user.</w:t>
             </w:r>
           </w:p>
         </w:tc>
@@ -842,7 +729,6 @@
                 <w:sz w:val="22"/>
                 <w:szCs w:val="22"/>
               </w:rPr>
-              <w:lastRenderedPageBreak/>
               <w:t>Account registration completed successfully.</w:t>
             </w:r>
           </w:p>
@@ -883,15 +769,7 @@
                 <w:sz w:val="22"/>
                 <w:szCs w:val="22"/>
               </w:rPr>
-              <w:t xml:space="preserve">A transient "Failed to fetch" message appeared during submission, but </w:t>
-            </w:r>
-            <w:r>
-              <w:rPr>
-                <w:sz w:val="22"/>
-                <w:szCs w:val="22"/>
-              </w:rPr>
-              <w:lastRenderedPageBreak/>
-              <w:t>registration ultimately succeeded and the user was logged in.</w:t>
+              <w:t>A transient "Failed to fetch" message appeared during submission, but registration ultimately succeeded and the user was logged in.</w:t>
             </w:r>
           </w:p>
         </w:tc>
@@ -917,14 +795,7 @@
                 <w:szCs w:val="22"/>
               </w:rPr>
               <w:lastRenderedPageBreak/>
-              <w:t>FR-G</w:t>
-            </w:r>
-            <w:r>
-              <w:rPr>
-                <w:sz w:val="22"/>
-                <w:szCs w:val="22"/>
-              </w:rPr>
-              <w:t>6</w:t>
+              <w:t>FR-G6</w:t>
             </w:r>
           </w:p>
         </w:tc>
@@ -1174,14 +1045,7 @@
                 <w:sz w:val="22"/>
                 <w:szCs w:val="22"/>
               </w:rPr>
-              <w:t>FR-C</w:t>
-            </w:r>
-            <w:r>
-              <w:rPr>
-                <w:sz w:val="22"/>
-                <w:szCs w:val="22"/>
-              </w:rPr>
-              <w:t>2</w:t>
+              <w:t>FR-C2</w:t>
             </w:r>
           </w:p>
         </w:tc>
@@ -1306,14 +1170,7 @@
                 <w:sz w:val="22"/>
                 <w:szCs w:val="22"/>
               </w:rPr>
-              <w:t>FR-C</w:t>
-            </w:r>
-            <w:r>
-              <w:rPr>
-                <w:sz w:val="22"/>
-                <w:szCs w:val="22"/>
-              </w:rPr>
-              <w:t>3</w:t>
+              <w:t>FR-C3</w:t>
             </w:r>
           </w:p>
         </w:tc>
@@ -1438,14 +1295,7 @@
                 <w:sz w:val="22"/>
                 <w:szCs w:val="22"/>
               </w:rPr>
-              <w:t>FR-C</w:t>
-            </w:r>
-            <w:r>
-              <w:rPr>
-                <w:sz w:val="22"/>
-                <w:szCs w:val="22"/>
-              </w:rPr>
-              <w:t>4</w:t>
+              <w:t>FR-C4</w:t>
             </w:r>
           </w:p>
         </w:tc>
@@ -1485,7 +1335,7 @@
                 <w:sz w:val="22"/>
                 <w:szCs w:val="22"/>
               </w:rPr>
-              <w:t>Logged in as a registered customer and applied catalogue filters. The filter controls could be selected, and the number of displayed games changed, but the results were not correctly restricted to the selected filter. For example, selecting the Card Game category still displayed games associated with other categories such as Strategy and Family.</w:t>
+              <w:t>Selecting a category filter returns products associated with that category. Multi-category products may appear under multiple filters.</w:t>
             </w:r>
           </w:p>
         </w:tc>
@@ -1505,71 +1355,8 @@
                 <w:sz w:val="22"/>
                 <w:szCs w:val="22"/>
               </w:rPr>
-              <w:t>F</w:t>
-            </w:r>
-            <w:r>
-              <w:rPr>
-                <w:sz w:val="22"/>
-                <w:szCs w:val="22"/>
-              </w:rPr>
-              <w:t xml:space="preserve">ilter partially changes the displayed results, but the results are not correctly restricted to the selected attribute. For example, selecting the </w:t>
-            </w:r>
-            <w:r>
-              <w:rPr>
-                <w:i/>
-                <w:iCs/>
-                <w:sz w:val="22"/>
-                <w:szCs w:val="22"/>
-              </w:rPr>
-              <w:t>Card Game</w:t>
-            </w:r>
-            <w:r>
-              <w:rPr>
-                <w:sz w:val="22"/>
-                <w:szCs w:val="22"/>
-              </w:rPr>
-              <w:t xml:space="preserve"> category still displays games associated with other categories such as </w:t>
-            </w:r>
-            <w:r>
-              <w:rPr>
-                <w:i/>
-                <w:iCs/>
-                <w:sz w:val="22"/>
-                <w:szCs w:val="22"/>
-              </w:rPr>
-              <w:t>Strategy</w:t>
-            </w:r>
-            <w:r>
-              <w:rPr>
-                <w:sz w:val="22"/>
-                <w:szCs w:val="22"/>
-              </w:rPr>
-              <w:t xml:space="preserve"> and </w:t>
-            </w:r>
-            <w:r>
-              <w:rPr>
-                <w:i/>
-                <w:iCs/>
-                <w:sz w:val="22"/>
-                <w:szCs w:val="22"/>
-              </w:rPr>
-              <w:t>Family</w:t>
-            </w:r>
-            <w:r>
-              <w:rPr>
-                <w:sz w:val="22"/>
-                <w:szCs w:val="22"/>
-              </w:rPr>
-              <w:t xml:space="preserve">. </w:t>
-            </w:r>
-          </w:p>
-          <w:p>
-            <w:pPr>
-              <w:rPr>
-                <w:sz w:val="22"/>
-                <w:szCs w:val="22"/>
-              </w:rPr>
-            </w:pPr>
+              <w:t>Category filtering works correctly for customers as well.</w:t>
+            </w:r>
           </w:p>
         </w:tc>
         <w:tc>
@@ -1588,7 +1375,7 @@
                 <w:sz w:val="22"/>
                 <w:szCs w:val="22"/>
               </w:rPr>
-              <w:t>Partial</w:t>
+              <w:t xml:space="preserve">Pass </w:t>
             </w:r>
           </w:p>
         </w:tc>
@@ -1608,7 +1395,7 @@
                 <w:sz w:val="22"/>
                 <w:szCs w:val="22"/>
               </w:rPr>
-              <w:t>Filter controls are present and affect the number of displayed products, but filtering does not correctly restrict results to the selected category.</w:t>
+              <w:t>Products can legitimately belong to multiple categories. For example, Dominion appears under both Card Games and Strategy. This is expected filtering behaviour rather than a defect.</w:t>
             </w:r>
           </w:p>
         </w:tc>
@@ -1633,14 +1420,7 @@
                 <w:sz w:val="22"/>
                 <w:szCs w:val="22"/>
               </w:rPr>
-              <w:t>FR-C</w:t>
-            </w:r>
-            <w:r>
-              <w:rPr>
-                <w:sz w:val="22"/>
-                <w:szCs w:val="22"/>
-              </w:rPr>
-              <w:t>5</w:t>
+              <w:t>FR-C5</w:t>
             </w:r>
           </w:p>
         </w:tc>
@@ -1660,15 +1440,7 @@
                 <w:sz w:val="22"/>
                 <w:szCs w:val="22"/>
               </w:rPr>
-              <w:t xml:space="preserve">The system will allow registered customers </w:t>
-            </w:r>
-            <w:r>
-              <w:rPr>
-                <w:sz w:val="22"/>
-                <w:szCs w:val="22"/>
-              </w:rPr>
-              <w:lastRenderedPageBreak/>
-              <w:t>to view detailed product information.</w:t>
+              <w:t>The system will allow registered customers to view detailed product information.</w:t>
             </w:r>
           </w:p>
         </w:tc>
@@ -1688,16 +1460,7 @@
                 <w:sz w:val="22"/>
                 <w:szCs w:val="22"/>
               </w:rPr>
-              <w:lastRenderedPageBreak/>
-              <w:t xml:space="preserve">From the catalogue, selected a game card and verified that it opened a dedicated product-detail </w:t>
-            </w:r>
-            <w:r>
-              <w:rPr>
-                <w:sz w:val="22"/>
-                <w:szCs w:val="22"/>
-              </w:rPr>
-              <w:lastRenderedPageBreak/>
-              <w:t>view containing additional information about that game.</w:t>
+              <w:t>From the catalogue, selected a game card and verified that it opened a dedicated product-detail view containing additional information about that game.</w:t>
             </w:r>
           </w:p>
         </w:tc>
@@ -1717,7 +1480,6 @@
                 <w:sz w:val="22"/>
                 <w:szCs w:val="22"/>
               </w:rPr>
-              <w:lastRenderedPageBreak/>
               <w:t xml:space="preserve">Customer </w:t>
             </w:r>
             <w:r>
@@ -1772,15 +1534,7 @@
                 <w:sz w:val="22"/>
                 <w:szCs w:val="22"/>
               </w:rPr>
-              <w:t xml:space="preserve">Product detail functionality is implemented and </w:t>
-            </w:r>
-            <w:r>
-              <w:rPr>
-                <w:sz w:val="22"/>
-                <w:szCs w:val="22"/>
-              </w:rPr>
-              <w:lastRenderedPageBreak/>
-              <w:t>accessible from the catalogue.</w:t>
+              <w:t>Product detail functionality is implemented and accessible from the catalogue.</w:t>
             </w:r>
           </w:p>
         </w:tc>
@@ -1805,15 +1559,7 @@
                 <w:sz w:val="22"/>
                 <w:szCs w:val="22"/>
               </w:rPr>
-              <w:lastRenderedPageBreak/>
-              <w:t>FR-C</w:t>
-            </w:r>
-            <w:r>
-              <w:rPr>
-                <w:sz w:val="22"/>
-                <w:szCs w:val="22"/>
-              </w:rPr>
-              <w:t>6</w:t>
+              <w:t>FR-C6</w:t>
             </w:r>
           </w:p>
         </w:tc>
@@ -1968,14 +1714,8 @@
                 <w:sz w:val="22"/>
                 <w:szCs w:val="22"/>
               </w:rPr>
-              <w:t>FR-C</w:t>
-            </w:r>
-            <w:r>
-              <w:rPr>
-                <w:sz w:val="22"/>
-                <w:szCs w:val="22"/>
-              </w:rPr>
-              <w:t>7</w:t>
+              <w:lastRenderedPageBreak/>
+              <w:t>FR-C7</w:t>
             </w:r>
           </w:p>
         </w:tc>
@@ -2100,14 +1840,7 @@
                 <w:sz w:val="22"/>
                 <w:szCs w:val="22"/>
               </w:rPr>
-              <w:t>FR-C</w:t>
-            </w:r>
-            <w:r>
-              <w:rPr>
-                <w:sz w:val="22"/>
-                <w:szCs w:val="22"/>
-              </w:rPr>
-              <w:t>8</w:t>
+              <w:t>FR-C8</w:t>
             </w:r>
           </w:p>
         </w:tc>
@@ -2232,14 +1965,7 @@
                 <w:sz w:val="22"/>
                 <w:szCs w:val="22"/>
               </w:rPr>
-              <w:t>FR-C</w:t>
-            </w:r>
-            <w:r>
-              <w:rPr>
-                <w:sz w:val="22"/>
-                <w:szCs w:val="22"/>
-              </w:rPr>
-              <w:t>9</w:t>
+              <w:t>FR-C9</w:t>
             </w:r>
           </w:p>
         </w:tc>
@@ -2364,14 +2090,7 @@
                 <w:sz w:val="22"/>
                 <w:szCs w:val="22"/>
               </w:rPr>
-              <w:t>FR-C1</w:t>
-            </w:r>
-            <w:r>
-              <w:rPr>
-                <w:sz w:val="22"/>
-                <w:szCs w:val="22"/>
-              </w:rPr>
-              <w:t>0</w:t>
+              <w:t>FR-C10</w:t>
             </w:r>
           </w:p>
         </w:tc>
@@ -2528,15 +2247,7 @@
                 <w:sz w:val="22"/>
                 <w:szCs w:val="22"/>
               </w:rPr>
-              <w:lastRenderedPageBreak/>
-              <w:t>FR-C1</w:t>
-            </w:r>
-            <w:r>
-              <w:rPr>
-                <w:sz w:val="22"/>
-                <w:szCs w:val="22"/>
-              </w:rPr>
-              <w:t>1</w:t>
+              <w:t>FR-C11</w:t>
             </w:r>
           </w:p>
         </w:tc>
@@ -2661,14 +2372,8 @@
                 <w:sz w:val="22"/>
                 <w:szCs w:val="22"/>
               </w:rPr>
-              <w:t>FR-C1</w:t>
-            </w:r>
-            <w:r>
-              <w:rPr>
-                <w:sz w:val="22"/>
-                <w:szCs w:val="22"/>
-              </w:rPr>
-              <w:t>2</w:t>
+              <w:lastRenderedPageBreak/>
+              <w:t>FR-C12</w:t>
             </w:r>
           </w:p>
         </w:tc>
@@ -2793,14 +2498,7 @@
                 <w:sz w:val="22"/>
                 <w:szCs w:val="22"/>
               </w:rPr>
-              <w:t>FR-C1</w:t>
-            </w:r>
-            <w:r>
-              <w:rPr>
-                <w:sz w:val="22"/>
-                <w:szCs w:val="22"/>
-              </w:rPr>
-              <w:t>3</w:t>
+              <w:t>FR-C13</w:t>
             </w:r>
           </w:p>
         </w:tc>
@@ -2925,14 +2623,7 @@
                 <w:sz w:val="22"/>
                 <w:szCs w:val="22"/>
               </w:rPr>
-              <w:t>FR-C1</w:t>
-            </w:r>
-            <w:r>
-              <w:rPr>
-                <w:sz w:val="22"/>
-                <w:szCs w:val="22"/>
-              </w:rPr>
-              <w:t>4</w:t>
+              <w:t>FR-C14</w:t>
             </w:r>
           </w:p>
         </w:tc>
@@ -3191,14 +2882,7 @@
                 <w:sz w:val="22"/>
                 <w:szCs w:val="22"/>
               </w:rPr>
-              <w:t>FR-A</w:t>
-            </w:r>
-            <w:r>
-              <w:rPr>
-                <w:sz w:val="22"/>
-                <w:szCs w:val="22"/>
-              </w:rPr>
-              <w:t>2</w:t>
+              <w:t>FR-A2</w:t>
             </w:r>
           </w:p>
         </w:tc>
@@ -3218,15 +2902,7 @@
                 <w:sz w:val="22"/>
                 <w:szCs w:val="22"/>
               </w:rPr>
-              <w:t xml:space="preserve">The system will allow administrators to </w:t>
-            </w:r>
-            <w:r>
-              <w:rPr>
-                <w:sz w:val="22"/>
-                <w:szCs w:val="22"/>
-              </w:rPr>
-              <w:lastRenderedPageBreak/>
-              <w:t>view product information.</w:t>
+              <w:t>The system will allow administrators to view product information.</w:t>
             </w:r>
           </w:p>
         </w:tc>
@@ -3246,16 +2922,7 @@
                 <w:sz w:val="22"/>
                 <w:szCs w:val="22"/>
               </w:rPr>
-              <w:lastRenderedPageBreak/>
-              <w:t xml:space="preserve">Logged in as an administrator and inspected the product-management table, which displayed the </w:t>
-            </w:r>
-            <w:r>
-              <w:rPr>
-                <w:sz w:val="22"/>
-                <w:szCs w:val="22"/>
-              </w:rPr>
-              <w:lastRenderedPageBreak/>
-              <w:t>available games and their associated product information.</w:t>
+              <w:t>Logged in as an administrator and inspected the product-management table, which displayed the available games and their associated product information.</w:t>
             </w:r>
           </w:p>
         </w:tc>
@@ -3275,16 +2942,7 @@
                 <w:sz w:val="22"/>
                 <w:szCs w:val="22"/>
               </w:rPr>
-              <w:lastRenderedPageBreak/>
-              <w:t xml:space="preserve">The admin dashboard displays existing games </w:t>
-            </w:r>
-            <w:r>
-              <w:rPr>
-                <w:sz w:val="22"/>
-                <w:szCs w:val="22"/>
-              </w:rPr>
-              <w:lastRenderedPageBreak/>
-              <w:t>and their product information in a table.</w:t>
+              <w:t>The admin dashboard displays existing games and their product information in a table.</w:t>
             </w:r>
           </w:p>
         </w:tc>
@@ -3304,7 +2962,6 @@
                 <w:sz w:val="22"/>
                 <w:szCs w:val="22"/>
               </w:rPr>
-              <w:lastRenderedPageBreak/>
               <w:t>Pass</w:t>
             </w:r>
           </w:p>
@@ -3325,15 +2982,7 @@
                 <w:sz w:val="22"/>
                 <w:szCs w:val="22"/>
               </w:rPr>
-              <w:t xml:space="preserve">Administrators can view product information </w:t>
-            </w:r>
-            <w:r>
-              <w:rPr>
-                <w:sz w:val="22"/>
-                <w:szCs w:val="22"/>
-              </w:rPr>
-              <w:lastRenderedPageBreak/>
-              <w:t>through the admin dashboard.</w:t>
+              <w:t>Administrators can view product information through the admin dashboard.</w:t>
             </w:r>
           </w:p>
         </w:tc>
@@ -3358,75 +3007,75 @@
                 <w:sz w:val="22"/>
                 <w:szCs w:val="22"/>
               </w:rPr>
+              <w:t>FR-A3</w:t>
+            </w:r>
+          </w:p>
+        </w:tc>
+        <w:tc>
+          <w:tcPr>
+            <w:tcW w:w="2142" w:type="dxa"/>
+          </w:tcPr>
+          <w:p>
+            <w:pPr>
+              <w:rPr>
+                <w:sz w:val="22"/>
+                <w:szCs w:val="22"/>
+              </w:rPr>
+            </w:pPr>
+            <w:r>
+              <w:rPr>
+                <w:sz w:val="22"/>
+                <w:szCs w:val="22"/>
+              </w:rPr>
+              <w:t>The system will allow administrators to update product information.</w:t>
+            </w:r>
+          </w:p>
+        </w:tc>
+        <w:tc>
+          <w:tcPr>
+            <w:tcW w:w="4874" w:type="dxa"/>
+          </w:tcPr>
+          <w:p>
+            <w:pPr>
+              <w:rPr>
+                <w:sz w:val="22"/>
+                <w:szCs w:val="22"/>
+              </w:rPr>
+            </w:pPr>
+            <w:r>
+              <w:rPr>
+                <w:sz w:val="22"/>
+                <w:szCs w:val="22"/>
+              </w:rPr>
+              <w:t>Logged in as an administrator, selected an existing product from the product table, opened the edit control, and verified that product information could be modified, including the quantity of items.</w:t>
+            </w:r>
+          </w:p>
+        </w:tc>
+        <w:tc>
+          <w:tcPr>
+            <w:tcW w:w="2639" w:type="dxa"/>
+          </w:tcPr>
+          <w:p>
+            <w:pPr>
+              <w:rPr>
+                <w:sz w:val="22"/>
+                <w:szCs w:val="22"/>
+              </w:rPr>
+            </w:pPr>
+            <w:r>
+              <w:rPr>
+                <w:sz w:val="22"/>
+                <w:szCs w:val="22"/>
+              </w:rPr>
+              <w:t xml:space="preserve">Administrators can select an existing product and edit its information </w:t>
+            </w:r>
+            <w:r>
+              <w:rPr>
+                <w:sz w:val="22"/>
+                <w:szCs w:val="22"/>
+              </w:rPr>
               <w:lastRenderedPageBreak/>
-              <w:t>FR-A</w:t>
-            </w:r>
-            <w:r>
-              <w:rPr>
-                <w:sz w:val="22"/>
-                <w:szCs w:val="22"/>
-              </w:rPr>
-              <w:t>3</w:t>
-            </w:r>
-          </w:p>
-        </w:tc>
-        <w:tc>
-          <w:tcPr>
-            <w:tcW w:w="2142" w:type="dxa"/>
-          </w:tcPr>
-          <w:p>
-            <w:pPr>
-              <w:rPr>
-                <w:sz w:val="22"/>
-                <w:szCs w:val="22"/>
-              </w:rPr>
-            </w:pPr>
-            <w:r>
-              <w:rPr>
-                <w:sz w:val="22"/>
-                <w:szCs w:val="22"/>
-              </w:rPr>
-              <w:t>The system will allow administrators to update product information.</w:t>
-            </w:r>
-          </w:p>
-        </w:tc>
-        <w:tc>
-          <w:tcPr>
-            <w:tcW w:w="4874" w:type="dxa"/>
-          </w:tcPr>
-          <w:p>
-            <w:pPr>
-              <w:rPr>
-                <w:sz w:val="22"/>
-                <w:szCs w:val="22"/>
-              </w:rPr>
-            </w:pPr>
-            <w:r>
-              <w:rPr>
-                <w:sz w:val="22"/>
-                <w:szCs w:val="22"/>
-              </w:rPr>
-              <w:t>Logged in as an administrator, selected an existing product from the product table, opened the edit control, and verified that product information could be modified, including the quantity of items.</w:t>
-            </w:r>
-          </w:p>
-        </w:tc>
-        <w:tc>
-          <w:tcPr>
-            <w:tcW w:w="2639" w:type="dxa"/>
-          </w:tcPr>
-          <w:p>
-            <w:pPr>
-              <w:rPr>
-                <w:sz w:val="22"/>
-                <w:szCs w:val="22"/>
-              </w:rPr>
-            </w:pPr>
-            <w:r>
-              <w:rPr>
-                <w:sz w:val="22"/>
-                <w:szCs w:val="22"/>
-              </w:rPr>
-              <w:t>Administrators can select an existing product and edit its information through the admin dashboard.</w:t>
+              <w:t>through the admin dashboard.</w:t>
             </w:r>
           </w:p>
         </w:tc>
@@ -3446,6 +3095,7 @@
                 <w:sz w:val="22"/>
                 <w:szCs w:val="22"/>
               </w:rPr>
+              <w:lastRenderedPageBreak/>
               <w:t>Pass</w:t>
             </w:r>
           </w:p>
@@ -3491,14 +3141,7 @@
                 <w:sz w:val="22"/>
                 <w:szCs w:val="22"/>
               </w:rPr>
-              <w:t>FR-A</w:t>
-            </w:r>
-            <w:r>
-              <w:rPr>
-                <w:sz w:val="22"/>
-                <w:szCs w:val="22"/>
-              </w:rPr>
-              <w:t>4</w:t>
+              <w:t>FR-A4</w:t>
             </w:r>
           </w:p>
         </w:tc>
@@ -3630,14 +3273,7 @@
                 <w:sz w:val="22"/>
                 <w:szCs w:val="22"/>
               </w:rPr>
-              <w:t>FR-A</w:t>
-            </w:r>
-            <w:r>
-              <w:rPr>
-                <w:sz w:val="22"/>
-                <w:szCs w:val="22"/>
-              </w:rPr>
-              <w:t>5</w:t>
+              <w:t>FR-A5</w:t>
             </w:r>
           </w:p>
         </w:tc>
@@ -3769,14 +3405,7 @@
                 <w:sz w:val="22"/>
                 <w:szCs w:val="22"/>
               </w:rPr>
-              <w:t>FR-A</w:t>
-            </w:r>
-            <w:r>
-              <w:rPr>
-                <w:sz w:val="22"/>
-                <w:szCs w:val="22"/>
-              </w:rPr>
-              <w:t>6</w:t>
+              <w:t>FR-A6</w:t>
             </w:r>
           </w:p>
         </w:tc>
@@ -3901,14 +3530,7 @@
                 <w:sz w:val="22"/>
                 <w:szCs w:val="22"/>
               </w:rPr>
-              <w:t>FR-A</w:t>
-            </w:r>
-            <w:r>
-              <w:rPr>
-                <w:sz w:val="22"/>
-                <w:szCs w:val="22"/>
-              </w:rPr>
-              <w:t>7</w:t>
+              <w:t>FR-A7</w:t>
             </w:r>
           </w:p>
         </w:tc>
@@ -4033,14 +3655,7 @@
                 <w:sz w:val="22"/>
                 <w:szCs w:val="22"/>
               </w:rPr>
-              <w:t>FR-A</w:t>
-            </w:r>
-            <w:r>
-              <w:rPr>
-                <w:sz w:val="22"/>
-                <w:szCs w:val="22"/>
-              </w:rPr>
-              <w:t>8</w:t>
+              <w:t>FR-A8</w:t>
             </w:r>
           </w:p>
         </w:tc>
@@ -4165,115 +3780,115 @@
                 <w:sz w:val="22"/>
                 <w:szCs w:val="22"/>
               </w:rPr>
+              <w:t>FR-A9</w:t>
+            </w:r>
+          </w:p>
+        </w:tc>
+        <w:tc>
+          <w:tcPr>
+            <w:tcW w:w="2142" w:type="dxa"/>
+          </w:tcPr>
+          <w:p>
+            <w:pPr>
+              <w:rPr>
+                <w:sz w:val="22"/>
+                <w:szCs w:val="22"/>
+              </w:rPr>
+            </w:pPr>
+            <w:r>
+              <w:rPr>
+                <w:sz w:val="22"/>
+                <w:szCs w:val="22"/>
+              </w:rPr>
+              <w:t>The system will allow administrators to view and moderate customer reviews.</w:t>
+            </w:r>
+          </w:p>
+        </w:tc>
+        <w:tc>
+          <w:tcPr>
+            <w:tcW w:w="4874" w:type="dxa"/>
+          </w:tcPr>
+          <w:p>
+            <w:pPr>
+              <w:rPr>
+                <w:sz w:val="22"/>
+                <w:szCs w:val="22"/>
+              </w:rPr>
+            </w:pPr>
+            <w:r>
+              <w:rPr>
+                <w:sz w:val="22"/>
+                <w:szCs w:val="22"/>
+              </w:rPr>
+              <w:t>Logged in as an administrator and inspected the reviews section. The system reported that there are currently 0 reviews.</w:t>
+            </w:r>
+          </w:p>
+        </w:tc>
+        <w:tc>
+          <w:tcPr>
+            <w:tcW w:w="2639" w:type="dxa"/>
+          </w:tcPr>
+          <w:p>
+            <w:pPr>
+              <w:rPr>
+                <w:sz w:val="22"/>
+                <w:szCs w:val="22"/>
+              </w:rPr>
+            </w:pPr>
+            <w:r>
+              <w:rPr>
+                <w:sz w:val="22"/>
+                <w:szCs w:val="22"/>
+              </w:rPr>
+              <w:t>The admin review area currently contains zero reviews, so review moderation could not be exercised.</w:t>
+            </w:r>
+          </w:p>
+        </w:tc>
+        <w:tc>
+          <w:tcPr>
+            <w:tcW w:w="1417" w:type="dxa"/>
+          </w:tcPr>
+          <w:p>
+            <w:pPr>
+              <w:rPr>
+                <w:sz w:val="22"/>
+                <w:szCs w:val="22"/>
+              </w:rPr>
+            </w:pPr>
+            <w:r>
+              <w:rPr>
+                <w:sz w:val="22"/>
+                <w:szCs w:val="22"/>
+              </w:rPr>
+              <w:t>Unable to verify</w:t>
+            </w:r>
+          </w:p>
+        </w:tc>
+        <w:tc>
+          <w:tcPr>
+            <w:tcW w:w="2693" w:type="dxa"/>
+          </w:tcPr>
+          <w:p>
+            <w:pPr>
+              <w:rPr>
+                <w:sz w:val="22"/>
+                <w:szCs w:val="22"/>
+              </w:rPr>
+            </w:pPr>
+            <w:r>
+              <w:rPr>
+                <w:sz w:val="22"/>
+                <w:szCs w:val="22"/>
+              </w:rPr>
+              <w:t xml:space="preserve">End-to-end moderation requires at least one customer review. A review cannot currently be created through the normal customer flow because review submission requires </w:t>
+            </w:r>
+            <w:r>
+              <w:rPr>
+                <w:sz w:val="22"/>
+                <w:szCs w:val="22"/>
+              </w:rPr>
               <w:lastRenderedPageBreak/>
-              <w:t>FR-A</w:t>
-            </w:r>
-            <w:r>
-              <w:rPr>
-                <w:sz w:val="22"/>
-                <w:szCs w:val="22"/>
-              </w:rPr>
-              <w:t>9</w:t>
-            </w:r>
-          </w:p>
-        </w:tc>
-        <w:tc>
-          <w:tcPr>
-            <w:tcW w:w="2142" w:type="dxa"/>
-          </w:tcPr>
-          <w:p>
-            <w:pPr>
-              <w:rPr>
-                <w:sz w:val="22"/>
-                <w:szCs w:val="22"/>
-              </w:rPr>
-            </w:pPr>
-            <w:r>
-              <w:rPr>
-                <w:sz w:val="22"/>
-                <w:szCs w:val="22"/>
-              </w:rPr>
-              <w:t>The system will allow administrators to view and moderate customer reviews.</w:t>
-            </w:r>
-          </w:p>
-        </w:tc>
-        <w:tc>
-          <w:tcPr>
-            <w:tcW w:w="4874" w:type="dxa"/>
-          </w:tcPr>
-          <w:p>
-            <w:pPr>
-              <w:rPr>
-                <w:sz w:val="22"/>
-                <w:szCs w:val="22"/>
-              </w:rPr>
-            </w:pPr>
-            <w:r>
-              <w:rPr>
-                <w:sz w:val="22"/>
-                <w:szCs w:val="22"/>
-              </w:rPr>
-              <w:t>Logged in as an administrator and inspected the reviews section. The system reported that there are currently 0 reviews.</w:t>
-            </w:r>
-          </w:p>
-        </w:tc>
-        <w:tc>
-          <w:tcPr>
-            <w:tcW w:w="2639" w:type="dxa"/>
-          </w:tcPr>
-          <w:p>
-            <w:pPr>
-              <w:rPr>
-                <w:sz w:val="22"/>
-                <w:szCs w:val="22"/>
-              </w:rPr>
-            </w:pPr>
-            <w:r>
-              <w:rPr>
-                <w:sz w:val="22"/>
-                <w:szCs w:val="22"/>
-              </w:rPr>
-              <w:t>The admin review area currently contains zero reviews, so review moderation could not be exercised.</w:t>
-            </w:r>
-          </w:p>
-        </w:tc>
-        <w:tc>
-          <w:tcPr>
-            <w:tcW w:w="1417" w:type="dxa"/>
-          </w:tcPr>
-          <w:p>
-            <w:pPr>
-              <w:rPr>
-                <w:sz w:val="22"/>
-                <w:szCs w:val="22"/>
-              </w:rPr>
-            </w:pPr>
-            <w:r>
-              <w:rPr>
-                <w:sz w:val="22"/>
-                <w:szCs w:val="22"/>
-              </w:rPr>
-              <w:t>Unable to verify</w:t>
-            </w:r>
-          </w:p>
-        </w:tc>
-        <w:tc>
-          <w:tcPr>
-            <w:tcW w:w="2693" w:type="dxa"/>
-          </w:tcPr>
-          <w:p>
-            <w:pPr>
-              <w:rPr>
-                <w:sz w:val="22"/>
-                <w:szCs w:val="22"/>
-              </w:rPr>
-            </w:pPr>
-            <w:r>
-              <w:rPr>
-                <w:sz w:val="22"/>
-                <w:szCs w:val="22"/>
-              </w:rPr>
-              <w:t>End-to-end moderation requires at least one customer review. A review cannot currently be created through the normal customer flow because review submission requires a completed purchase, while checkout cannot currently place orders.</w:t>
+              <w:t>a completed purchase, while checkout cannot currently place orders.</w:t>
             </w:r>
           </w:p>
         </w:tc>
@@ -4298,14 +3913,8 @@
                 <w:sz w:val="22"/>
                 <w:szCs w:val="22"/>
               </w:rPr>
-              <w:t>FR-A1</w:t>
-            </w:r>
-            <w:r>
-              <w:rPr>
-                <w:sz w:val="22"/>
-                <w:szCs w:val="22"/>
-              </w:rPr>
-              <w:t>0</w:t>
+              <w:lastRenderedPageBreak/>
+              <w:t>FR-A10</w:t>
             </w:r>
           </w:p>
         </w:tc>
@@ -4345,49 +3954,7 @@
                 <w:sz w:val="22"/>
                 <w:szCs w:val="22"/>
               </w:rPr>
-              <w:t xml:space="preserve">Tested direct access to the </w:t>
-            </w:r>
-            <w:r>
-              <w:rPr>
-                <w:sz w:val="22"/>
-                <w:szCs w:val="22"/>
-              </w:rPr>
-              <w:t>admin</w:t>
-            </w:r>
-            <w:r>
-              <w:rPr>
-                <w:sz w:val="22"/>
-                <w:szCs w:val="22"/>
-              </w:rPr>
-              <w:t xml:space="preserve"> route as a guest, authenticated customer, and authenticated administrator. The guest was redirected to the Login page, the customer could not access the </w:t>
-            </w:r>
-            <w:r>
-              <w:rPr>
-                <w:sz w:val="22"/>
-                <w:szCs w:val="22"/>
-              </w:rPr>
-              <w:t>admin</w:t>
-            </w:r>
-            <w:r>
-              <w:rPr>
-                <w:sz w:val="22"/>
-                <w:szCs w:val="22"/>
-              </w:rPr>
-              <w:t xml:space="preserve"> area, and the administrator retained access to the </w:t>
-            </w:r>
-            <w:r>
-              <w:rPr>
-                <w:sz w:val="22"/>
-                <w:szCs w:val="22"/>
-              </w:rPr>
-              <w:t>admin</w:t>
-            </w:r>
-            <w:r>
-              <w:rPr>
-                <w:sz w:val="22"/>
-                <w:szCs w:val="22"/>
-              </w:rPr>
-              <w:t xml:space="preserve"> area.</w:t>
+              <w:t>Tested direct access to the admin route as a guest, authenticated customer, and authenticated administrator. The guest was redirected to the Login page, the customer could not access the admin area, and the administrator retained access to the admin area.</w:t>
             </w:r>
           </w:p>
         </w:tc>

</xml_diff>